<commit_message>
Fix TabPFN v3 row wrapping to two lines in Tables 1/2
Widen Model column (3.6cm -> 4.5cm, other columns 3.1cm -> 3.0cm to
compensate, total 16.5cm fits the 16.59cm content width) and drop the
TabPFN v3 row label to 10.5pt as a safety margin, so 'TabPFN v3 (Prior
Labs)' sits on one line.
</commit_message>
<xml_diff>
--- a/outputs/Tables_1_2_Publication.docx
+++ b/outputs/Tables_1_2_Publication.docx
@@ -34,7 +34,7 @@
       <w:tr>
         <w:tc>
           <w:tcPr>
-            <w:tcW w:type="dxa" w:w="2041"/>
+            <w:tcW w:type="dxa" w:w="2551"/>
             <w:vMerge w:val="restart"/>
             <w:tcBorders>
               <w:top w:val="nil" w:sz="18" w:color="000000" w:space="0"/>
@@ -65,7 +65,7 @@
         </w:tc>
         <w:tc>
           <w:tcPr>
-            <w:tcW w:type="dxa" w:w="3514"/>
+            <w:tcW w:type="dxa" w:w="3402"/>
             <w:gridSpan w:val="2"/>
             <w:tcBorders>
               <w:top w:val="single" w:sz="18" w:color="000000" w:space="0"/>
@@ -96,7 +96,7 @@
         </w:tc>
         <w:tc>
           <w:tcPr>
-            <w:tcW w:type="dxa" w:w="3514"/>
+            <w:tcW w:type="dxa" w:w="3402"/>
             <w:gridSpan w:val="2"/>
             <w:tcBorders>
               <w:top w:val="single" w:sz="18" w:color="000000" w:space="0"/>
@@ -129,7 +129,7 @@
       <w:tr>
         <w:tc>
           <w:tcPr>
-            <w:tcW w:type="dxa" w:w="2041"/>
+            <w:tcW w:type="dxa" w:w="2551"/>
             <w:vMerge/>
             <w:tcBorders>
               <w:top w:val="nil"/>
@@ -144,7 +144,7 @@
         </w:tc>
         <w:tc>
           <w:tcPr>
-            <w:tcW w:type="dxa" w:w="1757"/>
+            <w:tcW w:type="dxa" w:w="1701"/>
             <w:tcBorders>
               <w:top w:val="nil"/>
               <w:bottom w:val="single" w:sz="8" w:color="000000" w:space="0"/>
@@ -174,7 +174,7 @@
         </w:tc>
         <w:tc>
           <w:tcPr>
-            <w:tcW w:type="dxa" w:w="1757"/>
+            <w:tcW w:type="dxa" w:w="1701"/>
             <w:tcBorders>
               <w:top w:val="nil"/>
               <w:bottom w:val="single" w:sz="8" w:color="000000" w:space="0"/>
@@ -204,7 +204,7 @@
         </w:tc>
         <w:tc>
           <w:tcPr>
-            <w:tcW w:type="dxa" w:w="1757"/>
+            <w:tcW w:type="dxa" w:w="1701"/>
             <w:tcBorders>
               <w:top w:val="nil"/>
               <w:bottom w:val="single" w:sz="8" w:color="000000" w:space="0"/>
@@ -234,7 +234,7 @@
         </w:tc>
         <w:tc>
           <w:tcPr>
-            <w:tcW w:type="dxa" w:w="1757"/>
+            <w:tcW w:type="dxa" w:w="1701"/>
             <w:tcBorders>
               <w:top w:val="nil"/>
               <w:bottom w:val="single" w:sz="8" w:color="000000" w:space="0"/>
@@ -266,7 +266,7 @@
       <w:tr>
         <w:tc>
           <w:tcPr>
-            <w:tcW w:type="dxa" w:w="2041"/>
+            <w:tcW w:type="dxa" w:w="2551"/>
             <w:tcBorders>
               <w:top w:val="nil"/>
               <w:bottom w:val="nil"/>
@@ -296,7 +296,7 @@
         </w:tc>
         <w:tc>
           <w:tcPr>
-            <w:tcW w:type="dxa" w:w="1757"/>
+            <w:tcW w:type="dxa" w:w="1701"/>
             <w:tcBorders>
               <w:top w:val="nil"/>
               <w:bottom w:val="nil"/>
@@ -341,7 +341,7 @@
         </w:tc>
         <w:tc>
           <w:tcPr>
-            <w:tcW w:type="dxa" w:w="1757"/>
+            <w:tcW w:type="dxa" w:w="1701"/>
             <w:tcBorders>
               <w:top w:val="nil"/>
               <w:bottom w:val="nil"/>
@@ -386,7 +386,7 @@
         </w:tc>
         <w:tc>
           <w:tcPr>
-            <w:tcW w:type="dxa" w:w="1757"/>
+            <w:tcW w:type="dxa" w:w="1701"/>
             <w:tcBorders>
               <w:top w:val="nil"/>
               <w:bottom w:val="nil"/>
@@ -431,7 +431,7 @@
         </w:tc>
         <w:tc>
           <w:tcPr>
-            <w:tcW w:type="dxa" w:w="1757"/>
+            <w:tcW w:type="dxa" w:w="1701"/>
             <w:tcBorders>
               <w:top w:val="nil"/>
               <w:bottom w:val="nil"/>
@@ -478,7 +478,7 @@
       <w:tr>
         <w:tc>
           <w:tcPr>
-            <w:tcW w:type="dxa" w:w="2041"/>
+            <w:tcW w:type="dxa" w:w="2551"/>
             <w:tcBorders>
               <w:top w:val="nil"/>
               <w:bottom w:val="nil"/>
@@ -508,7 +508,7 @@
         </w:tc>
         <w:tc>
           <w:tcPr>
-            <w:tcW w:type="dxa" w:w="1757"/>
+            <w:tcW w:type="dxa" w:w="1701"/>
             <w:tcBorders>
               <w:top w:val="nil"/>
               <w:bottom w:val="nil"/>
@@ -553,7 +553,7 @@
         </w:tc>
         <w:tc>
           <w:tcPr>
-            <w:tcW w:type="dxa" w:w="1757"/>
+            <w:tcW w:type="dxa" w:w="1701"/>
             <w:tcBorders>
               <w:top w:val="nil"/>
               <w:bottom w:val="nil"/>
@@ -598,7 +598,7 @@
         </w:tc>
         <w:tc>
           <w:tcPr>
-            <w:tcW w:type="dxa" w:w="1757"/>
+            <w:tcW w:type="dxa" w:w="1701"/>
             <w:tcBorders>
               <w:top w:val="nil"/>
               <w:bottom w:val="nil"/>
@@ -643,7 +643,7 @@
         </w:tc>
         <w:tc>
           <w:tcPr>
-            <w:tcW w:type="dxa" w:w="1757"/>
+            <w:tcW w:type="dxa" w:w="1701"/>
             <w:tcBorders>
               <w:top w:val="nil"/>
               <w:bottom w:val="nil"/>
@@ -690,7 +690,7 @@
       <w:tr>
         <w:tc>
           <w:tcPr>
-            <w:tcW w:type="dxa" w:w="2041"/>
+            <w:tcW w:type="dxa" w:w="2551"/>
             <w:tcBorders>
               <w:top w:val="nil"/>
               <w:bottom w:val="nil"/>
@@ -720,7 +720,7 @@
         </w:tc>
         <w:tc>
           <w:tcPr>
-            <w:tcW w:type="dxa" w:w="1757"/>
+            <w:tcW w:type="dxa" w:w="1701"/>
             <w:tcBorders>
               <w:top w:val="nil"/>
               <w:bottom w:val="nil"/>
@@ -765,7 +765,7 @@
         </w:tc>
         <w:tc>
           <w:tcPr>
-            <w:tcW w:type="dxa" w:w="1757"/>
+            <w:tcW w:type="dxa" w:w="1701"/>
             <w:tcBorders>
               <w:top w:val="nil"/>
               <w:bottom w:val="nil"/>
@@ -810,7 +810,7 @@
         </w:tc>
         <w:tc>
           <w:tcPr>
-            <w:tcW w:type="dxa" w:w="1757"/>
+            <w:tcW w:type="dxa" w:w="1701"/>
             <w:tcBorders>
               <w:top w:val="nil"/>
               <w:bottom w:val="nil"/>
@@ -855,7 +855,7 @@
         </w:tc>
         <w:tc>
           <w:tcPr>
-            <w:tcW w:type="dxa" w:w="1757"/>
+            <w:tcW w:type="dxa" w:w="1701"/>
             <w:tcBorders>
               <w:top w:val="nil"/>
               <w:bottom w:val="nil"/>
@@ -902,7 +902,7 @@
       <w:tr>
         <w:tc>
           <w:tcPr>
-            <w:tcW w:type="dxa" w:w="2041"/>
+            <w:tcW w:type="dxa" w:w="2551"/>
             <w:tcBorders>
               <w:top w:val="nil"/>
               <w:bottom w:val="nil"/>
@@ -932,7 +932,7 @@
         </w:tc>
         <w:tc>
           <w:tcPr>
-            <w:tcW w:type="dxa" w:w="1757"/>
+            <w:tcW w:type="dxa" w:w="1701"/>
             <w:tcBorders>
               <w:top w:val="nil"/>
               <w:bottom w:val="nil"/>
@@ -977,7 +977,7 @@
         </w:tc>
         <w:tc>
           <w:tcPr>
-            <w:tcW w:type="dxa" w:w="1757"/>
+            <w:tcW w:type="dxa" w:w="1701"/>
             <w:tcBorders>
               <w:top w:val="nil"/>
               <w:bottom w:val="nil"/>
@@ -1022,7 +1022,7 @@
         </w:tc>
         <w:tc>
           <w:tcPr>
-            <w:tcW w:type="dxa" w:w="1757"/>
+            <w:tcW w:type="dxa" w:w="1701"/>
             <w:tcBorders>
               <w:top w:val="nil"/>
               <w:bottom w:val="nil"/>
@@ -1067,7 +1067,7 @@
         </w:tc>
         <w:tc>
           <w:tcPr>
-            <w:tcW w:type="dxa" w:w="1757"/>
+            <w:tcW w:type="dxa" w:w="1701"/>
             <w:tcBorders>
               <w:top w:val="nil"/>
               <w:bottom w:val="nil"/>
@@ -1114,7 +1114,7 @@
       <w:tr>
         <w:tc>
           <w:tcPr>
-            <w:tcW w:type="dxa" w:w="2041"/>
+            <w:tcW w:type="dxa" w:w="2551"/>
             <w:tcBorders>
               <w:top w:val="nil"/>
               <w:bottom w:val="single" w:sz="18" w:color="000000" w:space="0"/>
@@ -1136,7 +1136,7 @@
                 <w:rFonts w:ascii="Times New Roman" w:hAnsi="Times New Roman" w:cs="Times New Roman" w:eastAsia="Times New Roman"/>
                 <w:b w:val="0"/>
                 <w:i/>
-                <w:sz w:val="22"/>
+                <w:sz w:val="21"/>
               </w:rPr>
               <w:t>TabPFN v3 (Prior Labs)</w:t>
             </w:r>
@@ -1144,7 +1144,7 @@
         </w:tc>
         <w:tc>
           <w:tcPr>
-            <w:tcW w:type="dxa" w:w="1757"/>
+            <w:tcW w:type="dxa" w:w="1701"/>
             <w:tcBorders>
               <w:top w:val="nil"/>
               <w:bottom w:val="single" w:sz="18" w:color="000000" w:space="0"/>
@@ -1189,7 +1189,7 @@
         </w:tc>
         <w:tc>
           <w:tcPr>
-            <w:tcW w:type="dxa" w:w="1757"/>
+            <w:tcW w:type="dxa" w:w="1701"/>
             <w:tcBorders>
               <w:top w:val="nil"/>
               <w:bottom w:val="single" w:sz="18" w:color="000000" w:space="0"/>
@@ -1234,7 +1234,7 @@
         </w:tc>
         <w:tc>
           <w:tcPr>
-            <w:tcW w:type="dxa" w:w="1757"/>
+            <w:tcW w:type="dxa" w:w="1701"/>
             <w:tcBorders>
               <w:top w:val="nil"/>
               <w:bottom w:val="single" w:sz="18" w:color="000000" w:space="0"/>
@@ -1279,7 +1279,7 @@
         </w:tc>
         <w:tc>
           <w:tcPr>
-            <w:tcW w:type="dxa" w:w="1757"/>
+            <w:tcW w:type="dxa" w:w="1701"/>
             <w:tcBorders>
               <w:top w:val="nil"/>
               <w:bottom w:val="single" w:sz="18" w:color="000000" w:space="0"/>
@@ -1370,7 +1370,7 @@
       <w:tr>
         <w:tc>
           <w:tcPr>
-            <w:tcW w:type="dxa" w:w="2041"/>
+            <w:tcW w:type="dxa" w:w="2551"/>
             <w:vMerge w:val="restart"/>
             <w:tcBorders>
               <w:top w:val="nil" w:sz="18" w:color="000000" w:space="0"/>
@@ -1401,7 +1401,7 @@
         </w:tc>
         <w:tc>
           <w:tcPr>
-            <w:tcW w:type="dxa" w:w="3514"/>
+            <w:tcW w:type="dxa" w:w="3402"/>
             <w:gridSpan w:val="2"/>
             <w:tcBorders>
               <w:top w:val="single" w:sz="18" w:color="000000" w:space="0"/>
@@ -1432,7 +1432,7 @@
         </w:tc>
         <w:tc>
           <w:tcPr>
-            <w:tcW w:type="dxa" w:w="3514"/>
+            <w:tcW w:type="dxa" w:w="3402"/>
             <w:gridSpan w:val="2"/>
             <w:tcBorders>
               <w:top w:val="single" w:sz="18" w:color="000000" w:space="0"/>
@@ -1465,7 +1465,7 @@
       <w:tr>
         <w:tc>
           <w:tcPr>
-            <w:tcW w:type="dxa" w:w="2041"/>
+            <w:tcW w:type="dxa" w:w="2551"/>
             <w:vMerge/>
             <w:tcBorders>
               <w:top w:val="nil"/>
@@ -1480,7 +1480,7 @@
         </w:tc>
         <w:tc>
           <w:tcPr>
-            <w:tcW w:type="dxa" w:w="1757"/>
+            <w:tcW w:type="dxa" w:w="1701"/>
             <w:tcBorders>
               <w:top w:val="nil"/>
               <w:bottom w:val="single" w:sz="8" w:color="000000" w:space="0"/>
@@ -1510,7 +1510,7 @@
         </w:tc>
         <w:tc>
           <w:tcPr>
-            <w:tcW w:type="dxa" w:w="1757"/>
+            <w:tcW w:type="dxa" w:w="1701"/>
             <w:tcBorders>
               <w:top w:val="nil"/>
               <w:bottom w:val="single" w:sz="8" w:color="000000" w:space="0"/>
@@ -1540,7 +1540,7 @@
         </w:tc>
         <w:tc>
           <w:tcPr>
-            <w:tcW w:type="dxa" w:w="1757"/>
+            <w:tcW w:type="dxa" w:w="1701"/>
             <w:tcBorders>
               <w:top w:val="nil"/>
               <w:bottom w:val="single" w:sz="8" w:color="000000" w:space="0"/>
@@ -1570,7 +1570,7 @@
         </w:tc>
         <w:tc>
           <w:tcPr>
-            <w:tcW w:type="dxa" w:w="1757"/>
+            <w:tcW w:type="dxa" w:w="1701"/>
             <w:tcBorders>
               <w:top w:val="nil"/>
               <w:bottom w:val="single" w:sz="8" w:color="000000" w:space="0"/>
@@ -1602,7 +1602,7 @@
       <w:tr>
         <w:tc>
           <w:tcPr>
-            <w:tcW w:type="dxa" w:w="2041"/>
+            <w:tcW w:type="dxa" w:w="2551"/>
             <w:tcBorders>
               <w:top w:val="nil"/>
               <w:bottom w:val="nil"/>
@@ -1632,7 +1632,7 @@
         </w:tc>
         <w:tc>
           <w:tcPr>
-            <w:tcW w:type="dxa" w:w="1757"/>
+            <w:tcW w:type="dxa" w:w="1701"/>
             <w:tcBorders>
               <w:top w:val="nil"/>
               <w:bottom w:val="nil"/>
@@ -1677,7 +1677,7 @@
         </w:tc>
         <w:tc>
           <w:tcPr>
-            <w:tcW w:type="dxa" w:w="1757"/>
+            <w:tcW w:type="dxa" w:w="1701"/>
             <w:tcBorders>
               <w:top w:val="nil"/>
               <w:bottom w:val="nil"/>
@@ -1722,7 +1722,7 @@
         </w:tc>
         <w:tc>
           <w:tcPr>
-            <w:tcW w:type="dxa" w:w="1757"/>
+            <w:tcW w:type="dxa" w:w="1701"/>
             <w:tcBorders>
               <w:top w:val="nil"/>
               <w:bottom w:val="nil"/>
@@ -1767,7 +1767,7 @@
         </w:tc>
         <w:tc>
           <w:tcPr>
-            <w:tcW w:type="dxa" w:w="1757"/>
+            <w:tcW w:type="dxa" w:w="1701"/>
             <w:tcBorders>
               <w:top w:val="nil"/>
               <w:bottom w:val="nil"/>
@@ -1814,7 +1814,7 @@
       <w:tr>
         <w:tc>
           <w:tcPr>
-            <w:tcW w:type="dxa" w:w="2041"/>
+            <w:tcW w:type="dxa" w:w="2551"/>
             <w:tcBorders>
               <w:top w:val="nil"/>
               <w:bottom w:val="nil"/>
@@ -1844,7 +1844,7 @@
         </w:tc>
         <w:tc>
           <w:tcPr>
-            <w:tcW w:type="dxa" w:w="1757"/>
+            <w:tcW w:type="dxa" w:w="1701"/>
             <w:tcBorders>
               <w:top w:val="nil"/>
               <w:bottom w:val="nil"/>
@@ -1889,7 +1889,7 @@
         </w:tc>
         <w:tc>
           <w:tcPr>
-            <w:tcW w:type="dxa" w:w="1757"/>
+            <w:tcW w:type="dxa" w:w="1701"/>
             <w:tcBorders>
               <w:top w:val="nil"/>
               <w:bottom w:val="nil"/>
@@ -1934,7 +1934,7 @@
         </w:tc>
         <w:tc>
           <w:tcPr>
-            <w:tcW w:type="dxa" w:w="1757"/>
+            <w:tcW w:type="dxa" w:w="1701"/>
             <w:tcBorders>
               <w:top w:val="nil"/>
               <w:bottom w:val="nil"/>
@@ -1979,7 +1979,7 @@
         </w:tc>
         <w:tc>
           <w:tcPr>
-            <w:tcW w:type="dxa" w:w="1757"/>
+            <w:tcW w:type="dxa" w:w="1701"/>
             <w:tcBorders>
               <w:top w:val="nil"/>
               <w:bottom w:val="nil"/>
@@ -2026,7 +2026,7 @@
       <w:tr>
         <w:tc>
           <w:tcPr>
-            <w:tcW w:type="dxa" w:w="2041"/>
+            <w:tcW w:type="dxa" w:w="2551"/>
             <w:tcBorders>
               <w:top w:val="nil"/>
               <w:bottom w:val="nil"/>
@@ -2056,7 +2056,7 @@
         </w:tc>
         <w:tc>
           <w:tcPr>
-            <w:tcW w:type="dxa" w:w="1757"/>
+            <w:tcW w:type="dxa" w:w="1701"/>
             <w:tcBorders>
               <w:top w:val="nil"/>
               <w:bottom w:val="nil"/>
@@ -2101,7 +2101,7 @@
         </w:tc>
         <w:tc>
           <w:tcPr>
-            <w:tcW w:type="dxa" w:w="1757"/>
+            <w:tcW w:type="dxa" w:w="1701"/>
             <w:tcBorders>
               <w:top w:val="nil"/>
               <w:bottom w:val="nil"/>
@@ -2146,7 +2146,7 @@
         </w:tc>
         <w:tc>
           <w:tcPr>
-            <w:tcW w:type="dxa" w:w="1757"/>
+            <w:tcW w:type="dxa" w:w="1701"/>
             <w:tcBorders>
               <w:top w:val="nil"/>
               <w:bottom w:val="nil"/>
@@ -2191,7 +2191,7 @@
         </w:tc>
         <w:tc>
           <w:tcPr>
-            <w:tcW w:type="dxa" w:w="1757"/>
+            <w:tcW w:type="dxa" w:w="1701"/>
             <w:tcBorders>
               <w:top w:val="nil"/>
               <w:bottom w:val="nil"/>
@@ -2238,7 +2238,7 @@
       <w:tr>
         <w:tc>
           <w:tcPr>
-            <w:tcW w:type="dxa" w:w="2041"/>
+            <w:tcW w:type="dxa" w:w="2551"/>
             <w:tcBorders>
               <w:top w:val="nil"/>
               <w:bottom w:val="nil"/>
@@ -2268,7 +2268,7 @@
         </w:tc>
         <w:tc>
           <w:tcPr>
-            <w:tcW w:type="dxa" w:w="1757"/>
+            <w:tcW w:type="dxa" w:w="1701"/>
             <w:tcBorders>
               <w:top w:val="nil"/>
               <w:bottom w:val="nil"/>
@@ -2313,7 +2313,7 @@
         </w:tc>
         <w:tc>
           <w:tcPr>
-            <w:tcW w:type="dxa" w:w="1757"/>
+            <w:tcW w:type="dxa" w:w="1701"/>
             <w:tcBorders>
               <w:top w:val="nil"/>
               <w:bottom w:val="nil"/>
@@ -2358,7 +2358,7 @@
         </w:tc>
         <w:tc>
           <w:tcPr>
-            <w:tcW w:type="dxa" w:w="1757"/>
+            <w:tcW w:type="dxa" w:w="1701"/>
             <w:tcBorders>
               <w:top w:val="nil"/>
               <w:bottom w:val="nil"/>
@@ -2403,7 +2403,7 @@
         </w:tc>
         <w:tc>
           <w:tcPr>
-            <w:tcW w:type="dxa" w:w="1757"/>
+            <w:tcW w:type="dxa" w:w="1701"/>
             <w:tcBorders>
               <w:top w:val="nil"/>
               <w:bottom w:val="nil"/>
@@ -2450,7 +2450,7 @@
       <w:tr>
         <w:tc>
           <w:tcPr>
-            <w:tcW w:type="dxa" w:w="2041"/>
+            <w:tcW w:type="dxa" w:w="2551"/>
             <w:tcBorders>
               <w:top w:val="nil"/>
               <w:bottom w:val="single" w:sz="18" w:color="000000" w:space="0"/>
@@ -2472,7 +2472,7 @@
                 <w:rFonts w:ascii="Times New Roman" w:hAnsi="Times New Roman" w:cs="Times New Roman" w:eastAsia="Times New Roman"/>
                 <w:b w:val="0"/>
                 <w:i/>
-                <w:sz w:val="22"/>
+                <w:sz w:val="21"/>
               </w:rPr>
               <w:t>TabPFN v3 (Prior Labs)</w:t>
             </w:r>
@@ -2480,7 +2480,7 @@
         </w:tc>
         <w:tc>
           <w:tcPr>
-            <w:tcW w:type="dxa" w:w="1757"/>
+            <w:tcW w:type="dxa" w:w="1701"/>
             <w:tcBorders>
               <w:top w:val="nil"/>
               <w:bottom w:val="single" w:sz="18" w:color="000000" w:space="0"/>
@@ -2525,7 +2525,7 @@
         </w:tc>
         <w:tc>
           <w:tcPr>
-            <w:tcW w:type="dxa" w:w="1757"/>
+            <w:tcW w:type="dxa" w:w="1701"/>
             <w:tcBorders>
               <w:top w:val="nil"/>
               <w:bottom w:val="single" w:sz="18" w:color="000000" w:space="0"/>
@@ -2570,7 +2570,7 @@
         </w:tc>
         <w:tc>
           <w:tcPr>
-            <w:tcW w:type="dxa" w:w="1757"/>
+            <w:tcW w:type="dxa" w:w="1701"/>
             <w:tcBorders>
               <w:top w:val="nil"/>
               <w:bottom w:val="single" w:sz="18" w:color="000000" w:space="0"/>
@@ -2615,7 +2615,7 @@
         </w:tc>
         <w:tc>
           <w:tcPr>
-            <w:tcW w:type="dxa" w:w="1757"/>
+            <w:tcW w:type="dxa" w:w="1701"/>
             <w:tcBorders>
               <w:top w:val="nil"/>
               <w:bottom w:val="single" w:sz="18" w:color="000000" w:space="0"/>

</xml_diff>

<commit_message>
Update SHAP mean-rank panel figure styling; refresh docx binary encoding
shap_mean_rank_panel.{png,svg,tiff}: Times New Roman throughout, light grey
vertical gridlines at major x-tick intervals (behind bars via zorder/
axisbelow), overall figure suptitle added. Per-panel x-axis scales left
independent (predictor counts differ by cohort). Top/right spines were
already removed. src/15_shap_mean_rank_panel.py stays local-only per
existing .gitignore policy for graph-only scripts.

Table2_Calibration.docx / Tables_1_2_Publication.docx: binary size changed
(re-saved by Word/Pages outside this session) but content verified
unchanged - committing to keep the tree clean.
</commit_message>
<xml_diff>
--- a/outputs/Tables_1_2_Publication.docx
+++ b/outputs/Tables_1_2_Publication.docx
@@ -1299,6 +1299,10 @@
             <w:pPr>
               <w:spacing w:after="60"/>
               <w:jc w:val="center"/>
+              <w:rPr>
+                <w:rFonts w:ascii="Times New Roman" w:eastAsia="Times New Roman" w:hAnsi="Times New Roman" w:cs="Times New Roman"/>
+                <w:sz w:val="18"/>
+              </w:rPr>
             </w:pPr>
             <w:r>
               <w:rPr>
@@ -1311,7 +1315,20 @@
                 <w:rFonts w:ascii="Times New Roman" w:eastAsia="Times New Roman" w:hAnsi="Times New Roman" w:cs="Times New Roman"/>
                 <w:sz w:val="18"/>
               </w:rPr>
-              <w:t xml:space="preserve"> (Cal 0.719)</w:t>
+              <w:t xml:space="preserve"> </w:t>
+            </w:r>
+          </w:p>
+          <w:p>
+            <w:pPr>
+              <w:spacing w:after="60"/>
+              <w:jc w:val="center"/>
+            </w:pPr>
+            <w:r>
+              <w:rPr>
+                <w:rFonts w:ascii="Times New Roman" w:eastAsia="Times New Roman" w:hAnsi="Times New Roman" w:cs="Times New Roman"/>
+                <w:sz w:val="18"/>
+              </w:rPr>
+              <w:t>(Cal 0.719)</w:t>
             </w:r>
           </w:p>
         </w:tc>
@@ -1330,6 +1347,10 @@
             <w:pPr>
               <w:spacing w:after="60"/>
               <w:jc w:val="center"/>
+              <w:rPr>
+                <w:rFonts w:ascii="Times New Roman" w:eastAsia="Times New Roman" w:hAnsi="Times New Roman" w:cs="Times New Roman"/>
+                <w:sz w:val="18"/>
+              </w:rPr>
             </w:pPr>
             <w:r>
               <w:rPr>
@@ -1342,7 +1363,20 @@
                 <w:rFonts w:ascii="Times New Roman" w:eastAsia="Times New Roman" w:hAnsi="Times New Roman" w:cs="Times New Roman"/>
                 <w:sz w:val="18"/>
               </w:rPr>
-              <w:t xml:space="preserve"> (Cal 0.669)</w:t>
+              <w:t xml:space="preserve"> </w:t>
+            </w:r>
+          </w:p>
+          <w:p>
+            <w:pPr>
+              <w:spacing w:after="60"/>
+              <w:jc w:val="center"/>
+            </w:pPr>
+            <w:r>
+              <w:rPr>
+                <w:rFonts w:ascii="Times New Roman" w:eastAsia="Times New Roman" w:hAnsi="Times New Roman" w:cs="Times New Roman"/>
+                <w:sz w:val="18"/>
+              </w:rPr>
+              <w:t>(Cal 0.669)</w:t>
             </w:r>
           </w:p>
         </w:tc>
@@ -1361,6 +1395,10 @@
             <w:pPr>
               <w:spacing w:after="60"/>
               <w:jc w:val="center"/>
+              <w:rPr>
+                <w:rFonts w:ascii="Times New Roman" w:eastAsia="Times New Roman" w:hAnsi="Times New Roman" w:cs="Times New Roman"/>
+                <w:sz w:val="18"/>
+              </w:rPr>
             </w:pPr>
             <w:r>
               <w:rPr>
@@ -1373,7 +1411,20 @@
                 <w:rFonts w:ascii="Times New Roman" w:eastAsia="Times New Roman" w:hAnsi="Times New Roman" w:cs="Times New Roman"/>
                 <w:sz w:val="18"/>
               </w:rPr>
-              <w:t xml:space="preserve"> (Cal 0.873)</w:t>
+              <w:t xml:space="preserve"> </w:t>
+            </w:r>
+          </w:p>
+          <w:p>
+            <w:pPr>
+              <w:spacing w:after="60"/>
+              <w:jc w:val="center"/>
+            </w:pPr>
+            <w:r>
+              <w:rPr>
+                <w:rFonts w:ascii="Times New Roman" w:eastAsia="Times New Roman" w:hAnsi="Times New Roman" w:cs="Times New Roman"/>
+                <w:sz w:val="18"/>
+              </w:rPr>
+              <w:t>(Cal 0.873)</w:t>
             </w:r>
           </w:p>
         </w:tc>
@@ -1392,6 +1443,9 @@
             <w:pPr>
               <w:spacing w:after="60"/>
               <w:jc w:val="center"/>
+              <w:rPr>
+                <w:rFonts w:ascii="Times New Roman" w:eastAsia="Times New Roman" w:hAnsi="Times New Roman" w:cs="Times New Roman"/>
+              </w:rPr>
             </w:pPr>
             <w:r>
               <w:rPr>
@@ -1399,6 +1453,12 @@
               </w:rPr>
               <w:t>Brier 0.167</w:t>
             </w:r>
+          </w:p>
+          <w:p>
+            <w:pPr>
+              <w:spacing w:after="60"/>
+              <w:jc w:val="center"/>
+            </w:pPr>
             <w:r>
               <w:rPr>
                 <w:rFonts w:ascii="Times New Roman" w:eastAsia="Times New Roman" w:hAnsi="Times New Roman" w:cs="Times New Roman"/>
@@ -1451,6 +1511,10 @@
             <w:pPr>
               <w:spacing w:after="60"/>
               <w:jc w:val="center"/>
+              <w:rPr>
+                <w:rFonts w:ascii="Times New Roman" w:eastAsia="Times New Roman" w:hAnsi="Times New Roman" w:cs="Times New Roman"/>
+                <w:sz w:val="18"/>
+              </w:rPr>
             </w:pPr>
             <w:r>
               <w:rPr>
@@ -1464,7 +1528,20 @@
                 <w:rFonts w:ascii="Times New Roman" w:eastAsia="Times New Roman" w:hAnsi="Times New Roman" w:cs="Times New Roman"/>
                 <w:sz w:val="18"/>
               </w:rPr>
-              <w:t xml:space="preserve"> (Cal </w:t>
+              <w:t xml:space="preserve"> </w:t>
+            </w:r>
+          </w:p>
+          <w:p>
+            <w:pPr>
+              <w:spacing w:after="60"/>
+              <w:jc w:val="center"/>
+            </w:pPr>
+            <w:r>
+              <w:rPr>
+                <w:rFonts w:ascii="Times New Roman" w:eastAsia="Times New Roman" w:hAnsi="Times New Roman" w:cs="Times New Roman"/>
+                <w:sz w:val="18"/>
+              </w:rPr>
+              <w:t xml:space="preserve">(Cal </w:t>
             </w:r>
             <w:r>
               <w:rPr>
@@ -1498,6 +1575,10 @@
             <w:pPr>
               <w:spacing w:after="60"/>
               <w:jc w:val="center"/>
+              <w:rPr>
+                <w:rFonts w:ascii="Times New Roman" w:eastAsia="Times New Roman" w:hAnsi="Times New Roman" w:cs="Times New Roman"/>
+                <w:sz w:val="18"/>
+              </w:rPr>
             </w:pPr>
             <w:r>
               <w:rPr>
@@ -1511,7 +1592,20 @@
                 <w:rFonts w:ascii="Times New Roman" w:eastAsia="Times New Roman" w:hAnsi="Times New Roman" w:cs="Times New Roman"/>
                 <w:sz w:val="18"/>
               </w:rPr>
-              <w:t xml:space="preserve"> (Cal 0.827)</w:t>
+              <w:t xml:space="preserve"> </w:t>
+            </w:r>
+          </w:p>
+          <w:p>
+            <w:pPr>
+              <w:spacing w:after="60"/>
+              <w:jc w:val="center"/>
+            </w:pPr>
+            <w:r>
+              <w:rPr>
+                <w:rFonts w:ascii="Times New Roman" w:eastAsia="Times New Roman" w:hAnsi="Times New Roman" w:cs="Times New Roman"/>
+                <w:sz w:val="18"/>
+              </w:rPr>
+              <w:t>(Cal 0.827)</w:t>
             </w:r>
           </w:p>
         </w:tc>
@@ -1530,6 +1624,10 @@
             <w:pPr>
               <w:spacing w:after="60"/>
               <w:jc w:val="center"/>
+              <w:rPr>
+                <w:rFonts w:ascii="Times New Roman" w:eastAsia="Times New Roman" w:hAnsi="Times New Roman" w:cs="Times New Roman"/>
+                <w:sz w:val="18"/>
+              </w:rPr>
             </w:pPr>
             <w:r>
               <w:rPr>
@@ -1543,7 +1641,20 @@
                 <w:rFonts w:ascii="Times New Roman" w:eastAsia="Times New Roman" w:hAnsi="Times New Roman" w:cs="Times New Roman"/>
                 <w:sz w:val="18"/>
               </w:rPr>
-              <w:t xml:space="preserve"> (Cal </w:t>
+              <w:t xml:space="preserve"> </w:t>
+            </w:r>
+          </w:p>
+          <w:p>
+            <w:pPr>
+              <w:spacing w:after="60"/>
+              <w:jc w:val="center"/>
+            </w:pPr>
+            <w:r>
+              <w:rPr>
+                <w:rFonts w:ascii="Times New Roman" w:eastAsia="Times New Roman" w:hAnsi="Times New Roman" w:cs="Times New Roman"/>
+                <w:sz w:val="18"/>
+              </w:rPr>
+              <w:t xml:space="preserve">(Cal </w:t>
             </w:r>
             <w:r>
               <w:rPr>
@@ -1577,6 +1688,10 @@
             <w:pPr>
               <w:spacing w:after="60"/>
               <w:jc w:val="center"/>
+              <w:rPr>
+                <w:rFonts w:ascii="Times New Roman" w:eastAsia="Times New Roman" w:hAnsi="Times New Roman" w:cs="Times New Roman"/>
+                <w:sz w:val="18"/>
+              </w:rPr>
             </w:pPr>
             <w:r>
               <w:rPr>
@@ -1590,7 +1705,20 @@
                 <w:rFonts w:ascii="Times New Roman" w:eastAsia="Times New Roman" w:hAnsi="Times New Roman" w:cs="Times New Roman"/>
                 <w:sz w:val="18"/>
               </w:rPr>
-              <w:t xml:space="preserve"> (Cal 1.152)</w:t>
+              <w:t xml:space="preserve"> </w:t>
+            </w:r>
+          </w:p>
+          <w:p>
+            <w:pPr>
+              <w:spacing w:after="60"/>
+              <w:jc w:val="center"/>
+            </w:pPr>
+            <w:r>
+              <w:rPr>
+                <w:rFonts w:ascii="Times New Roman" w:eastAsia="Times New Roman" w:hAnsi="Times New Roman" w:cs="Times New Roman"/>
+                <w:sz w:val="18"/>
+              </w:rPr>
+              <w:t>(Cal 1.152)</w:t>
             </w:r>
           </w:p>
         </w:tc>
@@ -1637,6 +1765,9 @@
             <w:pPr>
               <w:spacing w:after="60"/>
               <w:jc w:val="center"/>
+              <w:rPr>
+                <w:rFonts w:ascii="Times New Roman" w:eastAsia="Times New Roman" w:hAnsi="Times New Roman" w:cs="Times New Roman"/>
+              </w:rPr>
             </w:pPr>
             <w:r>
               <w:rPr>
@@ -1644,6 +1775,12 @@
               </w:rPr>
               <w:t>Brier 0.224</w:t>
             </w:r>
+          </w:p>
+          <w:p>
+            <w:pPr>
+              <w:spacing w:after="60"/>
+              <w:jc w:val="center"/>
+            </w:pPr>
             <w:r>
               <w:rPr>
                 <w:rFonts w:ascii="Times New Roman" w:eastAsia="Times New Roman" w:hAnsi="Times New Roman" w:cs="Times New Roman"/>
@@ -1668,6 +1805,10 @@
             <w:pPr>
               <w:spacing w:after="60"/>
               <w:jc w:val="center"/>
+              <w:rPr>
+                <w:rFonts w:ascii="Times New Roman" w:eastAsia="Times New Roman" w:hAnsi="Times New Roman" w:cs="Times New Roman"/>
+                <w:sz w:val="18"/>
+              </w:rPr>
             </w:pPr>
             <w:r>
               <w:rPr>
@@ -1680,7 +1821,20 @@
                 <w:rFonts w:ascii="Times New Roman" w:eastAsia="Times New Roman" w:hAnsi="Times New Roman" w:cs="Times New Roman"/>
                 <w:sz w:val="18"/>
               </w:rPr>
-              <w:t xml:space="preserve"> (Cal 0.705)</w:t>
+              <w:t xml:space="preserve"> </w:t>
+            </w:r>
+          </w:p>
+          <w:p>
+            <w:pPr>
+              <w:spacing w:after="60"/>
+              <w:jc w:val="center"/>
+            </w:pPr>
+            <w:r>
+              <w:rPr>
+                <w:rFonts w:ascii="Times New Roman" w:eastAsia="Times New Roman" w:hAnsi="Times New Roman" w:cs="Times New Roman"/>
+                <w:sz w:val="18"/>
+              </w:rPr>
+              <w:t>(Cal 0.705)</w:t>
             </w:r>
           </w:p>
         </w:tc>
@@ -1699,6 +1853,10 @@
             <w:pPr>
               <w:spacing w:after="60"/>
               <w:jc w:val="center"/>
+              <w:rPr>
+                <w:rFonts w:ascii="Times New Roman" w:eastAsia="Times New Roman" w:hAnsi="Times New Roman" w:cs="Times New Roman"/>
+                <w:sz w:val="18"/>
+              </w:rPr>
             </w:pPr>
             <w:r>
               <w:rPr>
@@ -1711,7 +1869,20 @@
                 <w:rFonts w:ascii="Times New Roman" w:eastAsia="Times New Roman" w:hAnsi="Times New Roman" w:cs="Times New Roman"/>
                 <w:sz w:val="18"/>
               </w:rPr>
-              <w:t xml:space="preserve"> (Cal 1.288)</w:t>
+              <w:t xml:space="preserve"> </w:t>
+            </w:r>
+          </w:p>
+          <w:p>
+            <w:pPr>
+              <w:spacing w:after="60"/>
+              <w:jc w:val="center"/>
+            </w:pPr>
+            <w:r>
+              <w:rPr>
+                <w:rFonts w:ascii="Times New Roman" w:eastAsia="Times New Roman" w:hAnsi="Times New Roman" w:cs="Times New Roman"/>
+                <w:sz w:val="18"/>
+              </w:rPr>
+              <w:t>(Cal 1.288)</w:t>
             </w:r>
           </w:p>
         </w:tc>

</xml_diff>

<commit_message>
Merge Tables 1+2 into one 3-panel table; fix dangling cross-reference
Single table (20x6), one shared header block instead of two, one caption
instead of two. Three stacked panels sharing it:
  (a) Discrimination - AUROC (95% CI), bold=highest
  (b) Brier Score, bold=lowest (bare numbers - 'Brier' named once in the
      panel header instead of 30 times in cells)
  (c) Calibration Slope, bold=closest to 1.0 (bare numbers, same logic)

Cuts repetition significantly: no repeated header block, no repeated
'Brier'/'Cal' text per cell. 95% CIs kept in panel (a) as requested
(TRIPOD-expected, argumentative weight for the serial-biopsy interval).

Also fixes a dangling cross-reference: the old footnote pointed to
'Section 12 of the Methods document', a separate file - replaced with a
self-contained footnote (cites Riley et al. 2020 directly) that stays
correct regardless of where this table gets pasted.
</commit_message>
<xml_diff>
--- a/outputs/Tables_1_2_Publication.docx
+++ b/outputs/Tables_1_2_Publication.docx
@@ -4,7 +4,7 @@
   <w:body>
     <w:p>
       <w:pPr>
-        <w:spacing w:before="0" w:after="160"/>
+        <w:spacing w:after="160"/>
       </w:pPr>
       <w:r>
         <w:rPr>
@@ -13,7 +13,7 @@
           <w:i w:val="0"/>
           <w:sz w:val="22"/>
         </w:rPr>
-        <w:t>Table 1. Discrimination (AUROC, 95% CI) by model and cohort</w:t>
+        <w:t>Table 1. Model performance by cohort: discrimination, Brier score, and calibration slope</w:t>
       </w:r>
     </w:p>
     <w:tbl>
@@ -296,6 +296,39 @@
                 <w:sz w:val="22"/>
               </w:rPr>
               <w:t>ESRD 10-Year</w:t>
+            </w:r>
+          </w:p>
+        </w:tc>
+      </w:tr>
+      <w:tr>
+        <w:tc>
+          <w:tcPr>
+            <w:tcW w:type="dxa" w:w="12699"/>
+            <w:gridSpan w:val="6"/>
+            <w:tcBorders>
+              <w:top w:val="nil"/>
+              <w:bottom w:val="nil"/>
+              <w:left w:val="nil"/>
+              <w:right w:val="nil"/>
+              <w:insideH w:val="nil"/>
+              <w:insideV w:val="nil"/>
+            </w:tcBorders>
+            <w:vAlign w:val="center"/>
+          </w:tcPr>
+          <w:p>
+            <w:pPr>
+              <w:spacing w:after="60" w:before="120"/>
+              <w:jc w:val="left"/>
+            </w:pPr>
+            <w:r/>
+            <w:r>
+              <w:rPr>
+                <w:rFonts w:ascii="Times New Roman" w:hAnsi="Times New Roman" w:cs="Times New Roman" w:eastAsia="Times New Roman"/>
+                <w:b/>
+                <w:i w:val="0"/>
+                <w:sz w:val="22"/>
+              </w:rPr>
+              <w:t>(a) Discrimination — AUROC (95% CI)</w:t>
             </w:r>
           </w:p>
         </w:tc>
@@ -1214,7 +1247,7 @@
             <w:tcW w:type="dxa" w:w="2494"/>
             <w:tcBorders>
               <w:top w:val="nil"/>
-              <w:bottom w:val="single" w:sz="18" w:color="000000" w:space="0"/>
+              <w:bottom w:val="nil"/>
               <w:left w:val="nil"/>
               <w:right w:val="nil"/>
               <w:insideH w:val="nil"/>
@@ -1244,7 +1277,7 @@
             <w:tcW w:type="dxa" w:w="2041"/>
             <w:tcBorders>
               <w:top w:val="nil"/>
-              <w:bottom w:val="single" w:sz="18" w:color="000000" w:space="0"/>
+              <w:bottom w:val="nil"/>
               <w:left w:val="nil"/>
               <w:right w:val="nil"/>
               <w:insideH w:val="nil"/>
@@ -1283,7 +1316,7 @@
             <w:tcW w:type="dxa" w:w="2041"/>
             <w:tcBorders>
               <w:top w:val="nil"/>
-              <w:bottom w:val="single" w:sz="18" w:color="000000" w:space="0"/>
+              <w:bottom w:val="nil"/>
               <w:left w:val="nil"/>
               <w:right w:val="nil"/>
               <w:insideH w:val="nil"/>
@@ -1322,7 +1355,7 @@
             <w:tcW w:type="dxa" w:w="2041"/>
             <w:tcBorders>
               <w:top w:val="nil"/>
-              <w:bottom w:val="single" w:sz="18" w:color="000000" w:space="0"/>
+              <w:bottom w:val="nil"/>
               <w:left w:val="nil"/>
               <w:right w:val="nil"/>
               <w:insideH w:val="nil"/>
@@ -1361,7 +1394,7 @@
             <w:tcW w:type="dxa" w:w="2041"/>
             <w:tcBorders>
               <w:top w:val="nil"/>
-              <w:bottom w:val="single" w:sz="18" w:color="000000" w:space="0"/>
+              <w:bottom w:val="nil"/>
               <w:left w:val="nil"/>
               <w:right w:val="nil"/>
               <w:insideH w:val="nil"/>
@@ -1400,7 +1433,7 @@
             <w:tcW w:type="dxa" w:w="2041"/>
             <w:tcBorders>
               <w:top w:val="nil"/>
-              <w:bottom w:val="single" w:sz="18" w:color="000000" w:space="0"/>
+              <w:bottom w:val="nil"/>
               <w:left w:val="nil"/>
               <w:right w:val="nil"/>
               <w:insideH w:val="nil"/>
@@ -1435,79 +1468,14 @@
           </w:p>
         </w:tc>
       </w:tr>
-    </w:tbl>
-    <w:p>
-      <w:pPr>
-        <w:spacing w:before="120" w:after="360"/>
-      </w:pPr>
-      <w:r>
-        <w:rPr>
-          <w:rFonts w:ascii="Times New Roman" w:hAnsi="Times New Roman" w:cs="Times New Roman" w:eastAsia="Times New Roman"/>
-          <w:b w:val="0"/>
-          <w:i/>
-          <w:sz w:val="18"/>
-        </w:rPr>
-        <w:t>TabPFN v3 shown in italics for reference; not included in formal pairwise significance testing (DeLong's test) or bootstrap correction.</w:t>
-      </w:r>
-    </w:p>
-    <w:p>
-      <w:pPr>
-        <w:spacing w:before="120" w:after="720"/>
-      </w:pPr>
-      <w:r>
-        <w:rPr>
-          <w:rFonts w:ascii="Times New Roman" w:hAnsi="Times New Roman" w:cs="Times New Roman" w:eastAsia="Times New Roman"/>
-          <w:b w:val="0"/>
-          <w:i/>
-          <w:sz w:val="18"/>
-        </w:rPr>
-        <w:t>Serial Biopsy confidence intervals are wide (n=70, 34 events) — treat this column as exploratory; see Section 12 of the Methods document for the formal sample-size justification.</w:t>
-      </w:r>
-    </w:p>
-    <w:p>
-      <w:pPr>
-        <w:spacing w:before="240" w:after="160"/>
-      </w:pPr>
-      <w:r>
-        <w:rPr>
-          <w:rFonts w:ascii="Times New Roman" w:hAnsi="Times New Roman" w:cs="Times New Roman" w:eastAsia="Times New Roman"/>
-          <w:b/>
-          <w:i w:val="0"/>
-          <w:sz w:val="22"/>
-        </w:rPr>
-        <w:t>Table 2. Calibration performance (Brier score, calibration slope) by model and cohort</w:t>
-      </w:r>
-    </w:p>
-    <w:tbl>
-      <w:tblPr>
-        <w:tblStyle w:val="TableGrid"/>
-        <w:tblW w:type="auto" w:w="0"/>
-        <w:jc w:val="center"/>
-        <w:tblLayout w:type="fixed"/>
-        <w:tblLook w:firstColumn="1" w:firstRow="1" w:lastColumn="0" w:lastRow="0" w:noHBand="0" w:noVBand="1" w:val="04A0"/>
-        <w:tblCellMar>
-          <w:top w:w="60" w:type="dxa"/>
-          <w:bottom w:w="60" w:type="dxa"/>
-          <w:left w:w="100" w:type="dxa"/>
-          <w:right w:w="100" w:type="dxa"/>
-        </w:tblCellMar>
-      </w:tblPr>
-      <w:tblGrid>
-        <w:gridCol w:w="2168"/>
-        <w:gridCol w:w="2168"/>
-        <w:gridCol w:w="2168"/>
-        <w:gridCol w:w="2168"/>
-        <w:gridCol w:w="2168"/>
-        <w:gridCol w:w="2168"/>
-      </w:tblGrid>
       <w:tr>
         <w:tc>
           <w:tcPr>
-            <w:tcW w:type="dxa" w:w="2494"/>
-            <w:vMerge w:val="restart"/>
+            <w:tcW w:type="dxa" w:w="12699"/>
+            <w:gridSpan w:val="6"/>
             <w:tcBorders>
-              <w:top w:val="nil" w:sz="18" w:color="000000" w:space="0"/>
-              <w:bottom w:val="single" w:sz="8" w:color="000000" w:space="0"/>
+              <w:top w:val="nil"/>
+              <w:bottom w:val="nil"/>
               <w:left w:val="nil"/>
               <w:right w:val="nil"/>
               <w:insideH w:val="nil"/>
@@ -1517,7 +1485,7 @@
           </w:tcPr>
           <w:p>
             <w:pPr>
-              <w:spacing w:after="60" w:before="0"/>
+              <w:spacing w:after="60" w:before="120"/>
               <w:jc w:val="left"/>
             </w:pPr>
             <w:r/>
@@ -1528,236 +1496,7 @@
                 <w:i w:val="0"/>
                 <w:sz w:val="22"/>
               </w:rPr>
-              <w:t>Model</w:t>
-            </w:r>
-          </w:p>
-        </w:tc>
-        <w:tc>
-          <w:tcPr>
-            <w:tcW w:type="dxa" w:w="6123"/>
-            <w:gridSpan w:val="3"/>
-            <w:tcBorders>
-              <w:top w:val="single" w:sz="18" w:color="000000" w:space="0"/>
-              <w:bottom w:val="nil"/>
-              <w:left w:val="nil"/>
-              <w:right w:val="nil"/>
-              <w:insideH w:val="nil"/>
-              <w:insideV w:val="nil"/>
-            </w:tcBorders>
-            <w:vAlign w:val="center"/>
-          </w:tcPr>
-          <w:p>
-            <w:pPr>
-              <w:spacing w:after="60" w:before="0"/>
-              <w:jc w:val="center"/>
-            </w:pPr>
-            <w:r/>
-            <w:r>
-              <w:rPr>
-                <w:rFonts w:ascii="Times New Roman" w:hAnsi="Times New Roman" w:cs="Times New Roman" w:eastAsia="Times New Roman"/>
-                <w:b/>
-                <w:i w:val="0"/>
-                <w:sz w:val="22"/>
-              </w:rPr>
-              <w:t>Flare Cohorts</w:t>
-            </w:r>
-          </w:p>
-        </w:tc>
-        <w:tc>
-          <w:tcPr>
-            <w:tcW w:type="dxa" w:w="4082"/>
-            <w:gridSpan w:val="2"/>
-            <w:tcBorders>
-              <w:top w:val="single" w:sz="18" w:color="000000" w:space="0"/>
-              <w:bottom w:val="nil"/>
-              <w:left w:val="nil"/>
-              <w:right w:val="nil"/>
-              <w:insideH w:val="nil"/>
-              <w:insideV w:val="nil"/>
-            </w:tcBorders>
-            <w:vAlign w:val="center"/>
-          </w:tcPr>
-          <w:p>
-            <w:pPr>
-              <w:spacing w:after="60" w:before="0"/>
-              <w:jc w:val="center"/>
-            </w:pPr>
-            <w:r/>
-            <w:r>
-              <w:rPr>
-                <w:rFonts w:ascii="Times New Roman" w:hAnsi="Times New Roman" w:cs="Times New Roman" w:eastAsia="Times New Roman"/>
-                <w:b/>
-                <w:i w:val="0"/>
-                <w:sz w:val="22"/>
-              </w:rPr>
-              <w:t>Kidney Failure (ESRD) Cohorts</w:t>
-            </w:r>
-          </w:p>
-        </w:tc>
-      </w:tr>
-      <w:tr>
-        <w:tc>
-          <w:tcPr>
-            <w:tcW w:type="dxa" w:w="2494"/>
-            <w:vMerge/>
-            <w:tcBorders>
-              <w:top w:val="nil"/>
-              <w:bottom w:val="nil"/>
-              <w:left w:val="nil"/>
-              <w:right w:val="nil"/>
-              <w:insideH w:val="nil"/>
-              <w:insideV w:val="nil"/>
-            </w:tcBorders>
-          </w:tcPr>
-          <w:p/>
-        </w:tc>
-        <w:tc>
-          <w:tcPr>
-            <w:tcW w:type="dxa" w:w="2041"/>
-            <w:tcBorders>
-              <w:top w:val="nil"/>
-              <w:bottom w:val="single" w:sz="8" w:color="000000" w:space="0"/>
-              <w:left w:val="nil"/>
-              <w:right w:val="nil"/>
-              <w:insideH w:val="nil"/>
-              <w:insideV w:val="nil"/>
-            </w:tcBorders>
-            <w:vAlign w:val="center"/>
-          </w:tcPr>
-          <w:p>
-            <w:pPr>
-              <w:spacing w:after="60" w:before="0"/>
-              <w:jc w:val="center"/>
-            </w:pPr>
-            <w:r/>
-            <w:r>
-              <w:rPr>
-                <w:rFonts w:ascii="Times New Roman" w:hAnsi="Times New Roman" w:cs="Times New Roman" w:eastAsia="Times New Roman"/>
-                <w:b/>
-                <w:i w:val="0"/>
-                <w:sz w:val="22"/>
-              </w:rPr>
-              <w:t>1-Year Flare</w:t>
-            </w:r>
-          </w:p>
-        </w:tc>
-        <w:tc>
-          <w:tcPr>
-            <w:tcW w:type="dxa" w:w="2041"/>
-            <w:tcBorders>
-              <w:top w:val="nil"/>
-              <w:bottom w:val="single" w:sz="8" w:color="000000" w:space="0"/>
-              <w:left w:val="nil"/>
-              <w:right w:val="nil"/>
-              <w:insideH w:val="nil"/>
-              <w:insideV w:val="nil"/>
-            </w:tcBorders>
-            <w:vAlign w:val="center"/>
-          </w:tcPr>
-          <w:p>
-            <w:pPr>
-              <w:spacing w:after="60" w:before="0"/>
-              <w:jc w:val="center"/>
-            </w:pPr>
-            <w:r/>
-            <w:r>
-              <w:rPr>
-                <w:rFonts w:ascii="Times New Roman" w:hAnsi="Times New Roman" w:cs="Times New Roman" w:eastAsia="Times New Roman"/>
-                <w:b/>
-                <w:i w:val="0"/>
-                <w:sz w:val="22"/>
-              </w:rPr>
-              <w:t>5-Year Flare</w:t>
-            </w:r>
-          </w:p>
-        </w:tc>
-        <w:tc>
-          <w:tcPr>
-            <w:tcW w:type="dxa" w:w="2041"/>
-            <w:tcBorders>
-              <w:top w:val="nil"/>
-              <w:bottom w:val="single" w:sz="8" w:color="000000" w:space="0"/>
-              <w:left w:val="nil"/>
-              <w:right w:val="nil"/>
-              <w:insideH w:val="nil"/>
-              <w:insideV w:val="nil"/>
-            </w:tcBorders>
-            <w:vAlign w:val="center"/>
-          </w:tcPr>
-          <w:p>
-            <w:pPr>
-              <w:spacing w:after="60" w:before="0"/>
-              <w:jc w:val="center"/>
-            </w:pPr>
-            <w:r/>
-            <w:r>
-              <w:rPr>
-                <w:rFonts w:ascii="Times New Roman" w:hAnsi="Times New Roman" w:cs="Times New Roman" w:eastAsia="Times New Roman"/>
-                <w:b/>
-                <w:i w:val="0"/>
-                <w:sz w:val="22"/>
-              </w:rPr>
-              <w:t>Serial Biopsy</w:t>
-            </w:r>
-          </w:p>
-        </w:tc>
-        <w:tc>
-          <w:tcPr>
-            <w:tcW w:type="dxa" w:w="2041"/>
-            <w:tcBorders>
-              <w:top w:val="nil"/>
-              <w:bottom w:val="single" w:sz="8" w:color="000000" w:space="0"/>
-              <w:left w:val="nil"/>
-              <w:right w:val="nil"/>
-              <w:insideH w:val="nil"/>
-              <w:insideV w:val="nil"/>
-            </w:tcBorders>
-            <w:vAlign w:val="center"/>
-          </w:tcPr>
-          <w:p>
-            <w:pPr>
-              <w:spacing w:after="60" w:before="0"/>
-              <w:jc w:val="center"/>
-            </w:pPr>
-            <w:r/>
-            <w:r>
-              <w:rPr>
-                <w:rFonts w:ascii="Times New Roman" w:hAnsi="Times New Roman" w:cs="Times New Roman" w:eastAsia="Times New Roman"/>
-                <w:b/>
-                <w:i w:val="0"/>
-                <w:sz w:val="22"/>
-              </w:rPr>
-              <w:t>ESRD 5-Year</w:t>
-            </w:r>
-          </w:p>
-        </w:tc>
-        <w:tc>
-          <w:tcPr>
-            <w:tcW w:type="dxa" w:w="2041"/>
-            <w:tcBorders>
-              <w:top w:val="nil"/>
-              <w:bottom w:val="single" w:sz="8" w:color="000000" w:space="0"/>
-              <w:left w:val="nil"/>
-              <w:right w:val="nil"/>
-              <w:insideH w:val="nil"/>
-              <w:insideV w:val="nil"/>
-            </w:tcBorders>
-            <w:vAlign w:val="center"/>
-          </w:tcPr>
-          <w:p>
-            <w:pPr>
-              <w:spacing w:after="60" w:before="0"/>
-              <w:jc w:val="center"/>
-            </w:pPr>
-            <w:r/>
-            <w:r>
-              <w:rPr>
-                <w:rFonts w:ascii="Times New Roman" w:hAnsi="Times New Roman" w:cs="Times New Roman" w:eastAsia="Times New Roman"/>
-                <w:b/>
-                <w:i w:val="0"/>
-                <w:sz w:val="22"/>
-              </w:rPr>
-              <w:t>ESRD 10-Year</w:t>
+              <w:t>(b) Brier Score</w:t>
             </w:r>
           </w:p>
         </w:tc>
@@ -1819,34 +1558,7 @@
                 <w:i w:val="0"/>
                 <w:sz w:val="22"/>
               </w:rPr>
-              <w:t>Brier 0.220</w:t>
-            </w:r>
-            <w:r>
-              <w:rPr>
-                <w:rFonts w:ascii="Times New Roman" w:hAnsi="Times New Roman" w:cs="Times New Roman" w:eastAsia="Times New Roman"/>
-                <w:b w:val="0"/>
-                <w:i w:val="0"/>
-                <w:sz w:val="18"/>
-              </w:rPr>
-              <w:t xml:space="preserve"> (Cal </w:t>
-            </w:r>
-            <w:r>
-              <w:rPr>
-                <w:rFonts w:ascii="Times New Roman" w:hAnsi="Times New Roman" w:cs="Times New Roman" w:eastAsia="Times New Roman"/>
-                <w:b w:val="0"/>
-                <w:i w:val="0"/>
-                <w:sz w:val="18"/>
-              </w:rPr>
-              <w:t>0.719</w:t>
-            </w:r>
-            <w:r>
-              <w:rPr>
-                <w:rFonts w:ascii="Times New Roman" w:hAnsi="Times New Roman" w:cs="Times New Roman" w:eastAsia="Times New Roman"/>
-                <w:b w:val="0"/>
-                <w:i w:val="0"/>
-                <w:sz w:val="18"/>
-              </w:rPr>
-              <w:t>)</w:t>
+              <w:t>0.220</w:t>
             </w:r>
           </w:p>
         </w:tc>
@@ -1876,34 +1588,7 @@
                 <w:i w:val="0"/>
                 <w:sz w:val="22"/>
               </w:rPr>
-              <w:t>Brier 0.232</w:t>
-            </w:r>
-            <w:r>
-              <w:rPr>
-                <w:rFonts w:ascii="Times New Roman" w:hAnsi="Times New Roman" w:cs="Times New Roman" w:eastAsia="Times New Roman"/>
-                <w:b w:val="0"/>
-                <w:i w:val="0"/>
-                <w:sz w:val="18"/>
-              </w:rPr>
-              <w:t xml:space="preserve"> (Cal </w:t>
-            </w:r>
-            <w:r>
-              <w:rPr>
-                <w:rFonts w:ascii="Times New Roman" w:hAnsi="Times New Roman" w:cs="Times New Roman" w:eastAsia="Times New Roman"/>
-                <w:b w:val="0"/>
-                <w:i w:val="0"/>
-                <w:sz w:val="18"/>
-              </w:rPr>
-              <w:t>0.669</w:t>
-            </w:r>
-            <w:r>
-              <w:rPr>
-                <w:rFonts w:ascii="Times New Roman" w:hAnsi="Times New Roman" w:cs="Times New Roman" w:eastAsia="Times New Roman"/>
-                <w:b w:val="0"/>
-                <w:i w:val="0"/>
-                <w:sz w:val="18"/>
-              </w:rPr>
-              <w:t>)</w:t>
+              <w:t>0.232</w:t>
             </w:r>
           </w:p>
         </w:tc>
@@ -1933,34 +1618,7 @@
                 <w:i w:val="0"/>
                 <w:sz w:val="22"/>
               </w:rPr>
-              <w:t>Brier 0.235</w:t>
-            </w:r>
-            <w:r>
-              <w:rPr>
-                <w:rFonts w:ascii="Times New Roman" w:hAnsi="Times New Roman" w:cs="Times New Roman" w:eastAsia="Times New Roman"/>
-                <w:b w:val="0"/>
-                <w:i w:val="0"/>
-                <w:sz w:val="18"/>
-              </w:rPr>
-              <w:t xml:space="preserve"> (Cal </w:t>
-            </w:r>
-            <w:r>
-              <w:rPr>
-                <w:rFonts w:ascii="Times New Roman" w:hAnsi="Times New Roman" w:cs="Times New Roman" w:eastAsia="Times New Roman"/>
-                <w:b/>
-                <w:i w:val="0"/>
-                <w:sz w:val="18"/>
-              </w:rPr>
-              <w:t>0.570</w:t>
-            </w:r>
-            <w:r>
-              <w:rPr>
-                <w:rFonts w:ascii="Times New Roman" w:hAnsi="Times New Roman" w:cs="Times New Roman" w:eastAsia="Times New Roman"/>
-                <w:b w:val="0"/>
-                <w:i w:val="0"/>
-                <w:sz w:val="18"/>
-              </w:rPr>
-              <w:t>)</w:t>
+              <w:t>0.235</w:t>
             </w:r>
           </w:p>
         </w:tc>
@@ -1990,34 +1648,7 @@
                 <w:i w:val="0"/>
                 <w:sz w:val="22"/>
               </w:rPr>
-              <w:t>Brier 0.178</w:t>
-            </w:r>
-            <w:r>
-              <w:rPr>
-                <w:rFonts w:ascii="Times New Roman" w:hAnsi="Times New Roman" w:cs="Times New Roman" w:eastAsia="Times New Roman"/>
-                <w:b w:val="0"/>
-                <w:i w:val="0"/>
-                <w:sz w:val="18"/>
-              </w:rPr>
-              <w:t xml:space="preserve"> (Cal </w:t>
-            </w:r>
-            <w:r>
-              <w:rPr>
-                <w:rFonts w:ascii="Times New Roman" w:hAnsi="Times New Roman" w:cs="Times New Roman" w:eastAsia="Times New Roman"/>
-                <w:b w:val="0"/>
-                <w:i w:val="0"/>
-                <w:sz w:val="18"/>
-              </w:rPr>
-              <w:t>0.873</w:t>
-            </w:r>
-            <w:r>
-              <w:rPr>
-                <w:rFonts w:ascii="Times New Roman" w:hAnsi="Times New Roman" w:cs="Times New Roman" w:eastAsia="Times New Roman"/>
-                <w:b w:val="0"/>
-                <w:i w:val="0"/>
-                <w:sz w:val="18"/>
-              </w:rPr>
-              <w:t>)</w:t>
+              <w:t>0.178</w:t>
             </w:r>
           </w:p>
         </w:tc>
@@ -2047,34 +1678,7 @@
                 <w:i w:val="0"/>
                 <w:sz w:val="22"/>
               </w:rPr>
-              <w:t>Brier 0.167</w:t>
-            </w:r>
-            <w:r>
-              <w:rPr>
-                <w:rFonts w:ascii="Times New Roman" w:hAnsi="Times New Roman" w:cs="Times New Roman" w:eastAsia="Times New Roman"/>
-                <w:b w:val="0"/>
-                <w:i w:val="0"/>
-                <w:sz w:val="18"/>
-              </w:rPr>
-              <w:t xml:space="preserve"> (Cal </w:t>
-            </w:r>
-            <w:r>
-              <w:rPr>
-                <w:rFonts w:ascii="Times New Roman" w:hAnsi="Times New Roman" w:cs="Times New Roman" w:eastAsia="Times New Roman"/>
-                <w:b w:val="0"/>
-                <w:i w:val="0"/>
-                <w:sz w:val="18"/>
-              </w:rPr>
-              <w:t>0.874</w:t>
-            </w:r>
-            <w:r>
-              <w:rPr>
-                <w:rFonts w:ascii="Times New Roman" w:hAnsi="Times New Roman" w:cs="Times New Roman" w:eastAsia="Times New Roman"/>
-                <w:b w:val="0"/>
-                <w:i w:val="0"/>
-                <w:sz w:val="18"/>
-              </w:rPr>
-              <w:t>)</w:t>
+              <w:t>0.167</w:t>
             </w:r>
           </w:p>
         </w:tc>
@@ -2136,34 +1740,7 @@
                 <w:i w:val="0"/>
                 <w:sz w:val="22"/>
               </w:rPr>
-              <w:t>Brier 0.211</w:t>
-            </w:r>
-            <w:r>
-              <w:rPr>
-                <w:rFonts w:ascii="Times New Roman" w:hAnsi="Times New Roman" w:cs="Times New Roman" w:eastAsia="Times New Roman"/>
-                <w:b w:val="0"/>
-                <w:i w:val="0"/>
-                <w:sz w:val="18"/>
-              </w:rPr>
-              <w:t xml:space="preserve"> (Cal </w:t>
-            </w:r>
-            <w:r>
-              <w:rPr>
-                <w:rFonts w:ascii="Times New Roman" w:hAnsi="Times New Roman" w:cs="Times New Roman" w:eastAsia="Times New Roman"/>
-                <w:b/>
-                <w:i w:val="0"/>
-                <w:sz w:val="18"/>
-              </w:rPr>
-              <w:t>0.849</w:t>
-            </w:r>
-            <w:r>
-              <w:rPr>
-                <w:rFonts w:ascii="Times New Roman" w:hAnsi="Times New Roman" w:cs="Times New Roman" w:eastAsia="Times New Roman"/>
-                <w:b w:val="0"/>
-                <w:i w:val="0"/>
-                <w:sz w:val="18"/>
-              </w:rPr>
-              <w:t>)</w:t>
+              <w:t>0.211</w:t>
             </w:r>
           </w:p>
         </w:tc>
@@ -2193,34 +1770,7 @@
                 <w:i w:val="0"/>
                 <w:sz w:val="22"/>
               </w:rPr>
-              <w:t>Brier 0.227</w:t>
-            </w:r>
-            <w:r>
-              <w:rPr>
-                <w:rFonts w:ascii="Times New Roman" w:hAnsi="Times New Roman" w:cs="Times New Roman" w:eastAsia="Times New Roman"/>
-                <w:b w:val="0"/>
-                <w:i w:val="0"/>
-                <w:sz w:val="18"/>
-              </w:rPr>
-              <w:t xml:space="preserve"> (Cal </w:t>
-            </w:r>
-            <w:r>
-              <w:rPr>
-                <w:rFonts w:ascii="Times New Roman" w:hAnsi="Times New Roman" w:cs="Times New Roman" w:eastAsia="Times New Roman"/>
-                <w:b w:val="0"/>
-                <w:i w:val="0"/>
-                <w:sz w:val="18"/>
-              </w:rPr>
-              <w:t>0.827</w:t>
-            </w:r>
-            <w:r>
-              <w:rPr>
-                <w:rFonts w:ascii="Times New Roman" w:hAnsi="Times New Roman" w:cs="Times New Roman" w:eastAsia="Times New Roman"/>
-                <w:b w:val="0"/>
-                <w:i w:val="0"/>
-                <w:sz w:val="18"/>
-              </w:rPr>
-              <w:t>)</w:t>
+              <w:t>0.227</w:t>
             </w:r>
           </w:p>
         </w:tc>
@@ -2250,34 +1800,7 @@
                 <w:i w:val="0"/>
                 <w:sz w:val="22"/>
               </w:rPr>
-              <w:t>Brier 0.251</w:t>
-            </w:r>
-            <w:r>
-              <w:rPr>
-                <w:rFonts w:ascii="Times New Roman" w:hAnsi="Times New Roman" w:cs="Times New Roman" w:eastAsia="Times New Roman"/>
-                <w:b w:val="0"/>
-                <w:i w:val="0"/>
-                <w:sz w:val="18"/>
-              </w:rPr>
-              <w:t xml:space="preserve"> (Cal </w:t>
-            </w:r>
-            <w:r>
-              <w:rPr>
-                <w:rFonts w:ascii="Times New Roman" w:hAnsi="Times New Roman" w:cs="Times New Roman" w:eastAsia="Times New Roman"/>
-                <w:b w:val="0"/>
-                <w:i w:val="0"/>
-                <w:sz w:val="18"/>
-              </w:rPr>
-              <w:t>0.320</w:t>
-            </w:r>
-            <w:r>
-              <w:rPr>
-                <w:rFonts w:ascii="Times New Roman" w:hAnsi="Times New Roman" w:cs="Times New Roman" w:eastAsia="Times New Roman"/>
-                <w:b w:val="0"/>
-                <w:i w:val="0"/>
-                <w:sz w:val="18"/>
-              </w:rPr>
-              <w:t>)</w:t>
+              <w:t>0.251</w:t>
             </w:r>
           </w:p>
         </w:tc>
@@ -2307,34 +1830,7 @@
                 <w:i w:val="0"/>
                 <w:sz w:val="22"/>
               </w:rPr>
-              <w:t>Brier 0.164</w:t>
-            </w:r>
-            <w:r>
-              <w:rPr>
-                <w:rFonts w:ascii="Times New Roman" w:hAnsi="Times New Roman" w:cs="Times New Roman" w:eastAsia="Times New Roman"/>
-                <w:b w:val="0"/>
-                <w:i w:val="0"/>
-                <w:sz w:val="18"/>
-              </w:rPr>
-              <w:t xml:space="preserve"> (Cal </w:t>
-            </w:r>
-            <w:r>
-              <w:rPr>
-                <w:rFonts w:ascii="Times New Roman" w:hAnsi="Times New Roman" w:cs="Times New Roman" w:eastAsia="Times New Roman"/>
-                <w:b/>
-                <w:i w:val="0"/>
-                <w:sz w:val="18"/>
-              </w:rPr>
-              <w:t>1.013</w:t>
-            </w:r>
-            <w:r>
-              <w:rPr>
-                <w:rFonts w:ascii="Times New Roman" w:hAnsi="Times New Roman" w:cs="Times New Roman" w:eastAsia="Times New Roman"/>
-                <w:b w:val="0"/>
-                <w:i w:val="0"/>
-                <w:sz w:val="18"/>
-              </w:rPr>
-              <w:t>)</w:t>
+              <w:t>0.164</w:t>
             </w:r>
           </w:p>
         </w:tc>
@@ -2364,34 +1860,7 @@
                 <w:i w:val="0"/>
                 <w:sz w:val="22"/>
               </w:rPr>
-              <w:t>Brier 0.139</w:t>
-            </w:r>
-            <w:r>
-              <w:rPr>
-                <w:rFonts w:ascii="Times New Roman" w:hAnsi="Times New Roman" w:cs="Times New Roman" w:eastAsia="Times New Roman"/>
-                <w:b w:val="0"/>
-                <w:i w:val="0"/>
-                <w:sz w:val="18"/>
-              </w:rPr>
-              <w:t xml:space="preserve"> (Cal </w:t>
-            </w:r>
-            <w:r>
-              <w:rPr>
-                <w:rFonts w:ascii="Times New Roman" w:hAnsi="Times New Roman" w:cs="Times New Roman" w:eastAsia="Times New Roman"/>
-                <w:b w:val="0"/>
-                <w:i w:val="0"/>
-                <w:sz w:val="18"/>
-              </w:rPr>
-              <w:t>1.152</w:t>
-            </w:r>
-            <w:r>
-              <w:rPr>
-                <w:rFonts w:ascii="Times New Roman" w:hAnsi="Times New Roman" w:cs="Times New Roman" w:eastAsia="Times New Roman"/>
-                <w:b w:val="0"/>
-                <w:i w:val="0"/>
-                <w:sz w:val="18"/>
-              </w:rPr>
-              <w:t>)</w:t>
+              <w:t>0.139</w:t>
             </w:r>
           </w:p>
         </w:tc>
@@ -2453,34 +1922,7 @@
                 <w:i w:val="0"/>
                 <w:sz w:val="22"/>
               </w:rPr>
-              <w:t>Brier 0.224</w:t>
-            </w:r>
-            <w:r>
-              <w:rPr>
-                <w:rFonts w:ascii="Times New Roman" w:hAnsi="Times New Roman" w:cs="Times New Roman" w:eastAsia="Times New Roman"/>
-                <w:b w:val="0"/>
-                <w:i w:val="0"/>
-                <w:sz w:val="18"/>
-              </w:rPr>
-              <w:t xml:space="preserve"> (Cal </w:t>
-            </w:r>
-            <w:r>
-              <w:rPr>
-                <w:rFonts w:ascii="Times New Roman" w:hAnsi="Times New Roman" w:cs="Times New Roman" w:eastAsia="Times New Roman"/>
-                <w:b w:val="0"/>
-                <w:i w:val="0"/>
-                <w:sz w:val="18"/>
-              </w:rPr>
-              <w:t>0.835</w:t>
-            </w:r>
-            <w:r>
-              <w:rPr>
-                <w:rFonts w:ascii="Times New Roman" w:hAnsi="Times New Roman" w:cs="Times New Roman" w:eastAsia="Times New Roman"/>
-                <w:b w:val="0"/>
-                <w:i w:val="0"/>
-                <w:sz w:val="18"/>
-              </w:rPr>
-              <w:t>)</w:t>
+              <w:t>0.224</w:t>
             </w:r>
           </w:p>
         </w:tc>
@@ -2510,34 +1952,7 @@
                 <w:i w:val="0"/>
                 <w:sz w:val="22"/>
               </w:rPr>
-              <w:t>Brier 0.239</w:t>
-            </w:r>
-            <w:r>
-              <w:rPr>
-                <w:rFonts w:ascii="Times New Roman" w:hAnsi="Times New Roman" w:cs="Times New Roman" w:eastAsia="Times New Roman"/>
-                <w:b w:val="0"/>
-                <w:i w:val="0"/>
-                <w:sz w:val="18"/>
-              </w:rPr>
-              <w:t xml:space="preserve"> (Cal </w:t>
-            </w:r>
-            <w:r>
-              <w:rPr>
-                <w:rFonts w:ascii="Times New Roman" w:hAnsi="Times New Roman" w:cs="Times New Roman" w:eastAsia="Times New Roman"/>
-                <w:b w:val="0"/>
-                <w:i w:val="0"/>
-                <w:sz w:val="18"/>
-              </w:rPr>
-              <w:t>0.705</w:t>
-            </w:r>
-            <w:r>
-              <w:rPr>
-                <w:rFonts w:ascii="Times New Roman" w:hAnsi="Times New Roman" w:cs="Times New Roman" w:eastAsia="Times New Roman"/>
-                <w:b w:val="0"/>
-                <w:i w:val="0"/>
-                <w:sz w:val="18"/>
-              </w:rPr>
-              <w:t>)</w:t>
+              <w:t>0.239</w:t>
             </w:r>
           </w:p>
         </w:tc>
@@ -2567,34 +1982,7 @@
                 <w:i w:val="0"/>
                 <w:sz w:val="22"/>
               </w:rPr>
-              <w:t>Brier 0.249</w:t>
-            </w:r>
-            <w:r>
-              <w:rPr>
-                <w:rFonts w:ascii="Times New Roman" w:hAnsi="Times New Roman" w:cs="Times New Roman" w:eastAsia="Times New Roman"/>
-                <w:b w:val="0"/>
-                <w:i w:val="0"/>
-                <w:sz w:val="18"/>
-              </w:rPr>
-              <w:t xml:space="preserve"> (Cal </w:t>
-            </w:r>
-            <w:r>
-              <w:rPr>
-                <w:rFonts w:ascii="Times New Roman" w:hAnsi="Times New Roman" w:cs="Times New Roman" w:eastAsia="Times New Roman"/>
-                <w:b w:val="0"/>
-                <w:i w:val="0"/>
-                <w:sz w:val="18"/>
-              </w:rPr>
-              <w:t>0.053</w:t>
-            </w:r>
-            <w:r>
-              <w:rPr>
-                <w:rFonts w:ascii="Times New Roman" w:hAnsi="Times New Roman" w:cs="Times New Roman" w:eastAsia="Times New Roman"/>
-                <w:b w:val="0"/>
-                <w:i w:val="0"/>
-                <w:sz w:val="18"/>
-              </w:rPr>
-              <w:t>)</w:t>
+              <w:t>0.249</w:t>
             </w:r>
           </w:p>
         </w:tc>
@@ -2624,34 +2012,7 @@
                 <w:i w:val="0"/>
                 <w:sz w:val="22"/>
               </w:rPr>
-              <w:t>Brier 0.178</w:t>
-            </w:r>
-            <w:r>
-              <w:rPr>
-                <w:rFonts w:ascii="Times New Roman" w:hAnsi="Times New Roman" w:cs="Times New Roman" w:eastAsia="Times New Roman"/>
-                <w:b w:val="0"/>
-                <w:i w:val="0"/>
-                <w:sz w:val="18"/>
-              </w:rPr>
-              <w:t xml:space="preserve"> (Cal </w:t>
-            </w:r>
-            <w:r>
-              <w:rPr>
-                <w:rFonts w:ascii="Times New Roman" w:hAnsi="Times New Roman" w:cs="Times New Roman" w:eastAsia="Times New Roman"/>
-                <w:b w:val="0"/>
-                <w:i w:val="0"/>
-                <w:sz w:val="18"/>
-              </w:rPr>
-              <w:t>1.288</w:t>
-            </w:r>
-            <w:r>
-              <w:rPr>
-                <w:rFonts w:ascii="Times New Roman" w:hAnsi="Times New Roman" w:cs="Times New Roman" w:eastAsia="Times New Roman"/>
-                <w:b w:val="0"/>
-                <w:i w:val="0"/>
-                <w:sz w:val="18"/>
-              </w:rPr>
-              <w:t>)</w:t>
+              <w:t>0.178</w:t>
             </w:r>
           </w:p>
         </w:tc>
@@ -2681,34 +2042,7 @@
                 <w:i w:val="0"/>
                 <w:sz w:val="22"/>
               </w:rPr>
-              <w:t>Brier 0.155</w:t>
-            </w:r>
-            <w:r>
-              <w:rPr>
-                <w:rFonts w:ascii="Times New Roman" w:hAnsi="Times New Roman" w:cs="Times New Roman" w:eastAsia="Times New Roman"/>
-                <w:b w:val="0"/>
-                <w:i w:val="0"/>
-                <w:sz w:val="18"/>
-              </w:rPr>
-              <w:t xml:space="preserve"> (Cal </w:t>
-            </w:r>
-            <w:r>
-              <w:rPr>
-                <w:rFonts w:ascii="Times New Roman" w:hAnsi="Times New Roman" w:cs="Times New Roman" w:eastAsia="Times New Roman"/>
-                <w:b/>
-                <w:i w:val="0"/>
-                <w:sz w:val="18"/>
-              </w:rPr>
-              <w:t>0.963</w:t>
-            </w:r>
-            <w:r>
-              <w:rPr>
-                <w:rFonts w:ascii="Times New Roman" w:hAnsi="Times New Roman" w:cs="Times New Roman" w:eastAsia="Times New Roman"/>
-                <w:b w:val="0"/>
-                <w:i w:val="0"/>
-                <w:sz w:val="18"/>
-              </w:rPr>
-              <w:t>)</w:t>
+              <w:t>0.155</w:t>
             </w:r>
           </w:p>
         </w:tc>
@@ -2770,34 +2104,7 @@
                 <w:i w:val="0"/>
                 <w:sz w:val="22"/>
               </w:rPr>
-              <w:t>Brier 0.224</w:t>
-            </w:r>
-            <w:r>
-              <w:rPr>
-                <w:rFonts w:ascii="Times New Roman" w:hAnsi="Times New Roman" w:cs="Times New Roman" w:eastAsia="Times New Roman"/>
-                <w:b w:val="0"/>
-                <w:i w:val="0"/>
-                <w:sz w:val="18"/>
-              </w:rPr>
-              <w:t xml:space="preserve"> (Cal </w:t>
-            </w:r>
-            <w:r>
-              <w:rPr>
-                <w:rFonts w:ascii="Times New Roman" w:hAnsi="Times New Roman" w:cs="Times New Roman" w:eastAsia="Times New Roman"/>
-                <w:b w:val="0"/>
-                <w:i w:val="0"/>
-                <w:sz w:val="18"/>
-              </w:rPr>
-              <w:t>0.686</w:t>
-            </w:r>
-            <w:r>
-              <w:rPr>
-                <w:rFonts w:ascii="Times New Roman" w:hAnsi="Times New Roman" w:cs="Times New Roman" w:eastAsia="Times New Roman"/>
-                <w:b w:val="0"/>
-                <w:i w:val="0"/>
-                <w:sz w:val="18"/>
-              </w:rPr>
-              <w:t>)</w:t>
+              <w:t>0.224</w:t>
             </w:r>
           </w:p>
         </w:tc>
@@ -2827,34 +2134,7 @@
                 <w:i w:val="0"/>
                 <w:sz w:val="22"/>
               </w:rPr>
-              <w:t>Brier 0.229</w:t>
-            </w:r>
-            <w:r>
-              <w:rPr>
-                <w:rFonts w:ascii="Times New Roman" w:hAnsi="Times New Roman" w:cs="Times New Roman" w:eastAsia="Times New Roman"/>
-                <w:b w:val="0"/>
-                <w:i w:val="0"/>
-                <w:sz w:val="18"/>
-              </w:rPr>
-              <w:t xml:space="preserve"> (Cal </w:t>
-            </w:r>
-            <w:r>
-              <w:rPr>
-                <w:rFonts w:ascii="Times New Roman" w:hAnsi="Times New Roman" w:cs="Times New Roman" w:eastAsia="Times New Roman"/>
-                <w:b/>
-                <w:i w:val="0"/>
-                <w:sz w:val="18"/>
-              </w:rPr>
-              <w:t>0.878</w:t>
-            </w:r>
-            <w:r>
-              <w:rPr>
-                <w:rFonts w:ascii="Times New Roman" w:hAnsi="Times New Roman" w:cs="Times New Roman" w:eastAsia="Times New Roman"/>
-                <w:b w:val="0"/>
-                <w:i w:val="0"/>
-                <w:sz w:val="18"/>
-              </w:rPr>
-              <w:t>)</w:t>
+              <w:t>0.229</w:t>
             </w:r>
           </w:p>
         </w:tc>
@@ -2884,34 +2164,7 @@
                 <w:i w:val="0"/>
                 <w:sz w:val="22"/>
               </w:rPr>
-              <w:t>Brier 0.240</w:t>
-            </w:r>
-            <w:r>
-              <w:rPr>
-                <w:rFonts w:ascii="Times New Roman" w:hAnsi="Times New Roman" w:cs="Times New Roman" w:eastAsia="Times New Roman"/>
-                <w:b w:val="0"/>
-                <w:i w:val="0"/>
-                <w:sz w:val="18"/>
-              </w:rPr>
-              <w:t xml:space="preserve"> (Cal </w:t>
-            </w:r>
-            <w:r>
-              <w:rPr>
-                <w:rFonts w:ascii="Times New Roman" w:hAnsi="Times New Roman" w:cs="Times New Roman" w:eastAsia="Times New Roman"/>
-                <w:b w:val="0"/>
-                <w:i w:val="0"/>
-                <w:sz w:val="18"/>
-              </w:rPr>
-              <w:t>0.346</w:t>
-            </w:r>
-            <w:r>
-              <w:rPr>
-                <w:rFonts w:ascii="Times New Roman" w:hAnsi="Times New Roman" w:cs="Times New Roman" w:eastAsia="Times New Roman"/>
-                <w:b w:val="0"/>
-                <w:i w:val="0"/>
-                <w:sz w:val="18"/>
-              </w:rPr>
-              <w:t>)</w:t>
+              <w:t>0.240</w:t>
             </w:r>
           </w:p>
         </w:tc>
@@ -2941,34 +2194,7 @@
                 <w:i w:val="0"/>
                 <w:sz w:val="22"/>
               </w:rPr>
-              <w:t>Brier 0.171</w:t>
-            </w:r>
-            <w:r>
-              <w:rPr>
-                <w:rFonts w:ascii="Times New Roman" w:hAnsi="Times New Roman" w:cs="Times New Roman" w:eastAsia="Times New Roman"/>
-                <w:b w:val="0"/>
-                <w:i w:val="0"/>
-                <w:sz w:val="18"/>
-              </w:rPr>
-              <w:t xml:space="preserve"> (Cal </w:t>
-            </w:r>
-            <w:r>
-              <w:rPr>
-                <w:rFonts w:ascii="Times New Roman" w:hAnsi="Times New Roman" w:cs="Times New Roman" w:eastAsia="Times New Roman"/>
-                <w:b w:val="0"/>
-                <w:i w:val="0"/>
-                <w:sz w:val="18"/>
-              </w:rPr>
-              <w:t>1.053</w:t>
-            </w:r>
-            <w:r>
-              <w:rPr>
-                <w:rFonts w:ascii="Times New Roman" w:hAnsi="Times New Roman" w:cs="Times New Roman" w:eastAsia="Times New Roman"/>
-                <w:b w:val="0"/>
-                <w:i w:val="0"/>
-                <w:sz w:val="18"/>
-              </w:rPr>
-              <w:t>)</w:t>
+              <w:t>0.171</w:t>
             </w:r>
           </w:p>
         </w:tc>
@@ -2998,34 +2224,950 @@
                 <w:i w:val="0"/>
                 <w:sz w:val="22"/>
               </w:rPr>
-              <w:t>Brier 0.140</w:t>
+              <w:t>0.140</w:t>
             </w:r>
+          </w:p>
+        </w:tc>
+      </w:tr>
+      <w:tr>
+        <w:tc>
+          <w:tcPr>
+            <w:tcW w:type="dxa" w:w="2494"/>
+            <w:tcBorders>
+              <w:top w:val="nil"/>
+              <w:bottom w:val="nil"/>
+              <w:left w:val="nil"/>
+              <w:right w:val="nil"/>
+              <w:insideH w:val="nil"/>
+              <w:insideV w:val="nil"/>
+            </w:tcBorders>
+            <w:vAlign w:val="center"/>
+          </w:tcPr>
+          <w:p>
+            <w:pPr>
+              <w:spacing w:after="60" w:before="0"/>
+              <w:jc w:val="left"/>
+            </w:pPr>
+            <w:r/>
+            <w:r>
+              <w:rPr>
+                <w:rFonts w:ascii="Times New Roman" w:hAnsi="Times New Roman" w:cs="Times New Roman" w:eastAsia="Times New Roman"/>
+                <w:b w:val="0"/>
+                <w:i/>
+                <w:sz w:val="21"/>
+              </w:rPr>
+              <w:t>TabPFN v3 (Prior Labs)</w:t>
+            </w:r>
+          </w:p>
+        </w:tc>
+        <w:tc>
+          <w:tcPr>
+            <w:tcW w:type="dxa" w:w="2041"/>
+            <w:tcBorders>
+              <w:top w:val="nil"/>
+              <w:bottom w:val="nil"/>
+              <w:left w:val="nil"/>
+              <w:right w:val="nil"/>
+              <w:insideH w:val="nil"/>
+              <w:insideV w:val="nil"/>
+            </w:tcBorders>
+            <w:vAlign w:val="center"/>
+          </w:tcPr>
+          <w:p>
+            <w:pPr>
+              <w:spacing w:after="60" w:before="0"/>
+              <w:jc w:val="center"/>
+            </w:pPr>
+            <w:r/>
+            <w:r>
+              <w:rPr>
+                <w:rFonts w:ascii="Times New Roman" w:hAnsi="Times New Roman" w:cs="Times New Roman" w:eastAsia="Times New Roman"/>
+                <w:b w:val="0"/>
+                <w:i/>
+                <w:sz w:val="22"/>
+              </w:rPr>
+              <w:t>0.166</w:t>
+            </w:r>
+          </w:p>
+        </w:tc>
+        <w:tc>
+          <w:tcPr>
+            <w:tcW w:type="dxa" w:w="2041"/>
+            <w:tcBorders>
+              <w:top w:val="nil"/>
+              <w:bottom w:val="nil"/>
+              <w:left w:val="nil"/>
+              <w:right w:val="nil"/>
+              <w:insideH w:val="nil"/>
+              <w:insideV w:val="nil"/>
+            </w:tcBorders>
+            <w:vAlign w:val="center"/>
+          </w:tcPr>
+          <w:p>
+            <w:pPr>
+              <w:spacing w:after="60" w:before="0"/>
+              <w:jc w:val="center"/>
+            </w:pPr>
+            <w:r/>
+            <w:r>
+              <w:rPr>
+                <w:rFonts w:ascii="Times New Roman" w:hAnsi="Times New Roman" w:cs="Times New Roman" w:eastAsia="Times New Roman"/>
+                <w:b w:val="0"/>
+                <w:i/>
+                <w:sz w:val="22"/>
+              </w:rPr>
+              <w:t>0.230</w:t>
+            </w:r>
+          </w:p>
+        </w:tc>
+        <w:tc>
+          <w:tcPr>
+            <w:tcW w:type="dxa" w:w="2041"/>
+            <w:tcBorders>
+              <w:top w:val="nil"/>
+              <w:bottom w:val="nil"/>
+              <w:left w:val="nil"/>
+              <w:right w:val="nil"/>
+              <w:insideH w:val="nil"/>
+              <w:insideV w:val="nil"/>
+            </w:tcBorders>
+            <w:vAlign w:val="center"/>
+          </w:tcPr>
+          <w:p>
+            <w:pPr>
+              <w:spacing w:after="60" w:before="0"/>
+              <w:jc w:val="center"/>
+            </w:pPr>
+            <w:r/>
+            <w:r>
+              <w:rPr>
+                <w:rFonts w:ascii="Times New Roman" w:hAnsi="Times New Roman" w:cs="Times New Roman" w:eastAsia="Times New Roman"/>
+                <w:b w:val="0"/>
+                <w:i/>
+                <w:sz w:val="22"/>
+              </w:rPr>
+              <w:t>0.251</w:t>
+            </w:r>
+          </w:p>
+        </w:tc>
+        <w:tc>
+          <w:tcPr>
+            <w:tcW w:type="dxa" w:w="2041"/>
+            <w:tcBorders>
+              <w:top w:val="nil"/>
+              <w:bottom w:val="nil"/>
+              <w:left w:val="nil"/>
+              <w:right w:val="nil"/>
+              <w:insideH w:val="nil"/>
+              <w:insideV w:val="nil"/>
+            </w:tcBorders>
+            <w:vAlign w:val="center"/>
+          </w:tcPr>
+          <w:p>
+            <w:pPr>
+              <w:spacing w:after="60" w:before="0"/>
+              <w:jc w:val="center"/>
+            </w:pPr>
+            <w:r/>
+            <w:r>
+              <w:rPr>
+                <w:rFonts w:ascii="Times New Roman" w:hAnsi="Times New Roman" w:cs="Times New Roman" w:eastAsia="Times New Roman"/>
+                <w:b w:val="0"/>
+                <w:i/>
+                <w:sz w:val="22"/>
+              </w:rPr>
+              <w:t>0.100</w:t>
+            </w:r>
+          </w:p>
+        </w:tc>
+        <w:tc>
+          <w:tcPr>
+            <w:tcW w:type="dxa" w:w="2041"/>
+            <w:tcBorders>
+              <w:top w:val="nil"/>
+              <w:bottom w:val="nil"/>
+              <w:left w:val="nil"/>
+              <w:right w:val="nil"/>
+              <w:insideH w:val="nil"/>
+              <w:insideV w:val="nil"/>
+            </w:tcBorders>
+            <w:vAlign w:val="center"/>
+          </w:tcPr>
+          <w:p>
+            <w:pPr>
+              <w:spacing w:after="60" w:before="0"/>
+              <w:jc w:val="center"/>
+            </w:pPr>
+            <w:r/>
+            <w:r>
+              <w:rPr>
+                <w:rFonts w:ascii="Times New Roman" w:hAnsi="Times New Roman" w:cs="Times New Roman" w:eastAsia="Times New Roman"/>
+                <w:b w:val="0"/>
+                <w:i/>
+                <w:sz w:val="22"/>
+              </w:rPr>
+              <w:t>0.122</w:t>
+            </w:r>
+          </w:p>
+        </w:tc>
+      </w:tr>
+      <w:tr>
+        <w:tc>
+          <w:tcPr>
+            <w:tcW w:type="dxa" w:w="12699"/>
+            <w:gridSpan w:val="6"/>
+            <w:tcBorders>
+              <w:top w:val="nil"/>
+              <w:bottom w:val="nil"/>
+              <w:left w:val="nil"/>
+              <w:right w:val="nil"/>
+              <w:insideH w:val="nil"/>
+              <w:insideV w:val="nil"/>
+            </w:tcBorders>
+            <w:vAlign w:val="center"/>
+          </w:tcPr>
+          <w:p>
+            <w:pPr>
+              <w:spacing w:after="60" w:before="120"/>
+              <w:jc w:val="left"/>
+            </w:pPr>
+            <w:r/>
+            <w:r>
+              <w:rPr>
+                <w:rFonts w:ascii="Times New Roman" w:hAnsi="Times New Roman" w:cs="Times New Roman" w:eastAsia="Times New Roman"/>
+                <w:b/>
+                <w:i w:val="0"/>
+                <w:sz w:val="22"/>
+              </w:rPr>
+              <w:t>(c) Calibration Slope</w:t>
+            </w:r>
+          </w:p>
+        </w:tc>
+      </w:tr>
+      <w:tr>
+        <w:tc>
+          <w:tcPr>
+            <w:tcW w:type="dxa" w:w="2494"/>
+            <w:tcBorders>
+              <w:top w:val="nil"/>
+              <w:bottom w:val="nil"/>
+              <w:left w:val="nil"/>
+              <w:right w:val="nil"/>
+              <w:insideH w:val="nil"/>
+              <w:insideV w:val="nil"/>
+            </w:tcBorders>
+            <w:vAlign w:val="center"/>
+          </w:tcPr>
+          <w:p>
+            <w:pPr>
+              <w:spacing w:after="60" w:before="0"/>
+              <w:jc w:val="left"/>
+            </w:pPr>
+            <w:r/>
             <w:r>
               <w:rPr>
                 <w:rFonts w:ascii="Times New Roman" w:hAnsi="Times New Roman" w:cs="Times New Roman" w:eastAsia="Times New Roman"/>
                 <w:b w:val="0"/>
                 <w:i w:val="0"/>
-                <w:sz w:val="18"/>
+                <w:sz w:val="22"/>
               </w:rPr>
-              <w:t xml:space="preserve"> (Cal </w:t>
+              <w:t>Logistic Regression</w:t>
             </w:r>
+          </w:p>
+        </w:tc>
+        <w:tc>
+          <w:tcPr>
+            <w:tcW w:type="dxa" w:w="2041"/>
+            <w:tcBorders>
+              <w:top w:val="nil"/>
+              <w:bottom w:val="nil"/>
+              <w:left w:val="nil"/>
+              <w:right w:val="nil"/>
+              <w:insideH w:val="nil"/>
+              <w:insideV w:val="nil"/>
+            </w:tcBorders>
+            <w:vAlign w:val="center"/>
+          </w:tcPr>
+          <w:p>
+            <w:pPr>
+              <w:spacing w:after="60" w:before="0"/>
+              <w:jc w:val="center"/>
+            </w:pPr>
+            <w:r/>
             <w:r>
               <w:rPr>
                 <w:rFonts w:ascii="Times New Roman" w:hAnsi="Times New Roman" w:cs="Times New Roman" w:eastAsia="Times New Roman"/>
                 <w:b w:val="0"/>
                 <w:i w:val="0"/>
-                <w:sz w:val="18"/>
+                <w:sz w:val="22"/>
               </w:rPr>
-              <w:t>0.714</w:t>
+              <w:t>0.719</w:t>
             </w:r>
+          </w:p>
+        </w:tc>
+        <w:tc>
+          <w:tcPr>
+            <w:tcW w:type="dxa" w:w="2041"/>
+            <w:tcBorders>
+              <w:top w:val="nil"/>
+              <w:bottom w:val="nil"/>
+              <w:left w:val="nil"/>
+              <w:right w:val="nil"/>
+              <w:insideH w:val="nil"/>
+              <w:insideV w:val="nil"/>
+            </w:tcBorders>
+            <w:vAlign w:val="center"/>
+          </w:tcPr>
+          <w:p>
+            <w:pPr>
+              <w:spacing w:after="60" w:before="0"/>
+              <w:jc w:val="center"/>
+            </w:pPr>
+            <w:r/>
             <w:r>
               <w:rPr>
                 <w:rFonts w:ascii="Times New Roman" w:hAnsi="Times New Roman" w:cs="Times New Roman" w:eastAsia="Times New Roman"/>
                 <w:b w:val="0"/>
                 <w:i w:val="0"/>
-                <w:sz w:val="18"/>
+                <w:sz w:val="22"/>
               </w:rPr>
-              <w:t>)</w:t>
+              <w:t>0.669</w:t>
+            </w:r>
+          </w:p>
+        </w:tc>
+        <w:tc>
+          <w:tcPr>
+            <w:tcW w:type="dxa" w:w="2041"/>
+            <w:tcBorders>
+              <w:top w:val="nil"/>
+              <w:bottom w:val="nil"/>
+              <w:left w:val="nil"/>
+              <w:right w:val="nil"/>
+              <w:insideH w:val="nil"/>
+              <w:insideV w:val="nil"/>
+            </w:tcBorders>
+            <w:vAlign w:val="center"/>
+          </w:tcPr>
+          <w:p>
+            <w:pPr>
+              <w:spacing w:after="60" w:before="0"/>
+              <w:jc w:val="center"/>
+            </w:pPr>
+            <w:r/>
+            <w:r>
+              <w:rPr>
+                <w:rFonts w:ascii="Times New Roman" w:hAnsi="Times New Roman" w:cs="Times New Roman" w:eastAsia="Times New Roman"/>
+                <w:b/>
+                <w:i w:val="0"/>
+                <w:sz w:val="22"/>
+              </w:rPr>
+              <w:t>0.570</w:t>
+            </w:r>
+          </w:p>
+        </w:tc>
+        <w:tc>
+          <w:tcPr>
+            <w:tcW w:type="dxa" w:w="2041"/>
+            <w:tcBorders>
+              <w:top w:val="nil"/>
+              <w:bottom w:val="nil"/>
+              <w:left w:val="nil"/>
+              <w:right w:val="nil"/>
+              <w:insideH w:val="nil"/>
+              <w:insideV w:val="nil"/>
+            </w:tcBorders>
+            <w:vAlign w:val="center"/>
+          </w:tcPr>
+          <w:p>
+            <w:pPr>
+              <w:spacing w:after="60" w:before="0"/>
+              <w:jc w:val="center"/>
+            </w:pPr>
+            <w:r/>
+            <w:r>
+              <w:rPr>
+                <w:rFonts w:ascii="Times New Roman" w:hAnsi="Times New Roman" w:cs="Times New Roman" w:eastAsia="Times New Roman"/>
+                <w:b w:val="0"/>
+                <w:i w:val="0"/>
+                <w:sz w:val="22"/>
+              </w:rPr>
+              <w:t>0.873</w:t>
+            </w:r>
+          </w:p>
+        </w:tc>
+        <w:tc>
+          <w:tcPr>
+            <w:tcW w:type="dxa" w:w="2041"/>
+            <w:tcBorders>
+              <w:top w:val="nil"/>
+              <w:bottom w:val="nil"/>
+              <w:left w:val="nil"/>
+              <w:right w:val="nil"/>
+              <w:insideH w:val="nil"/>
+              <w:insideV w:val="nil"/>
+            </w:tcBorders>
+            <w:vAlign w:val="center"/>
+          </w:tcPr>
+          <w:p>
+            <w:pPr>
+              <w:spacing w:after="60" w:before="0"/>
+              <w:jc w:val="center"/>
+            </w:pPr>
+            <w:r/>
+            <w:r>
+              <w:rPr>
+                <w:rFonts w:ascii="Times New Roman" w:hAnsi="Times New Roman" w:cs="Times New Roman" w:eastAsia="Times New Roman"/>
+                <w:b w:val="0"/>
+                <w:i w:val="0"/>
+                <w:sz w:val="22"/>
+              </w:rPr>
+              <w:t>0.874</w:t>
+            </w:r>
+          </w:p>
+        </w:tc>
+      </w:tr>
+      <w:tr>
+        <w:tc>
+          <w:tcPr>
+            <w:tcW w:type="dxa" w:w="2494"/>
+            <w:tcBorders>
+              <w:top w:val="nil"/>
+              <w:bottom w:val="nil"/>
+              <w:left w:val="nil"/>
+              <w:right w:val="nil"/>
+              <w:insideH w:val="nil"/>
+              <w:insideV w:val="nil"/>
+            </w:tcBorders>
+            <w:vAlign w:val="center"/>
+          </w:tcPr>
+          <w:p>
+            <w:pPr>
+              <w:spacing w:after="60" w:before="0"/>
+              <w:jc w:val="left"/>
+            </w:pPr>
+            <w:r/>
+            <w:r>
+              <w:rPr>
+                <w:rFonts w:ascii="Times New Roman" w:hAnsi="Times New Roman" w:cs="Times New Roman" w:eastAsia="Times New Roman"/>
+                <w:b w:val="0"/>
+                <w:i w:val="0"/>
+                <w:sz w:val="22"/>
+              </w:rPr>
+              <w:t>Random Forest</w:t>
+            </w:r>
+          </w:p>
+        </w:tc>
+        <w:tc>
+          <w:tcPr>
+            <w:tcW w:type="dxa" w:w="2041"/>
+            <w:tcBorders>
+              <w:top w:val="nil"/>
+              <w:bottom w:val="nil"/>
+              <w:left w:val="nil"/>
+              <w:right w:val="nil"/>
+              <w:insideH w:val="nil"/>
+              <w:insideV w:val="nil"/>
+            </w:tcBorders>
+            <w:vAlign w:val="center"/>
+          </w:tcPr>
+          <w:p>
+            <w:pPr>
+              <w:spacing w:after="60" w:before="0"/>
+              <w:jc w:val="center"/>
+            </w:pPr>
+            <w:r/>
+            <w:r>
+              <w:rPr>
+                <w:rFonts w:ascii="Times New Roman" w:hAnsi="Times New Roman" w:cs="Times New Roman" w:eastAsia="Times New Roman"/>
+                <w:b/>
+                <w:i w:val="0"/>
+                <w:sz w:val="22"/>
+              </w:rPr>
+              <w:t>0.849</w:t>
+            </w:r>
+          </w:p>
+        </w:tc>
+        <w:tc>
+          <w:tcPr>
+            <w:tcW w:type="dxa" w:w="2041"/>
+            <w:tcBorders>
+              <w:top w:val="nil"/>
+              <w:bottom w:val="nil"/>
+              <w:left w:val="nil"/>
+              <w:right w:val="nil"/>
+              <w:insideH w:val="nil"/>
+              <w:insideV w:val="nil"/>
+            </w:tcBorders>
+            <w:vAlign w:val="center"/>
+          </w:tcPr>
+          <w:p>
+            <w:pPr>
+              <w:spacing w:after="60" w:before="0"/>
+              <w:jc w:val="center"/>
+            </w:pPr>
+            <w:r/>
+            <w:r>
+              <w:rPr>
+                <w:rFonts w:ascii="Times New Roman" w:hAnsi="Times New Roman" w:cs="Times New Roman" w:eastAsia="Times New Roman"/>
+                <w:b w:val="0"/>
+                <w:i w:val="0"/>
+                <w:sz w:val="22"/>
+              </w:rPr>
+              <w:t>0.827</w:t>
+            </w:r>
+          </w:p>
+        </w:tc>
+        <w:tc>
+          <w:tcPr>
+            <w:tcW w:type="dxa" w:w="2041"/>
+            <w:tcBorders>
+              <w:top w:val="nil"/>
+              <w:bottom w:val="nil"/>
+              <w:left w:val="nil"/>
+              <w:right w:val="nil"/>
+              <w:insideH w:val="nil"/>
+              <w:insideV w:val="nil"/>
+            </w:tcBorders>
+            <w:vAlign w:val="center"/>
+          </w:tcPr>
+          <w:p>
+            <w:pPr>
+              <w:spacing w:after="60" w:before="0"/>
+              <w:jc w:val="center"/>
+            </w:pPr>
+            <w:r/>
+            <w:r>
+              <w:rPr>
+                <w:rFonts w:ascii="Times New Roman" w:hAnsi="Times New Roman" w:cs="Times New Roman" w:eastAsia="Times New Roman"/>
+                <w:b w:val="0"/>
+                <w:i w:val="0"/>
+                <w:sz w:val="22"/>
+              </w:rPr>
+              <w:t>0.320</w:t>
+            </w:r>
+          </w:p>
+        </w:tc>
+        <w:tc>
+          <w:tcPr>
+            <w:tcW w:type="dxa" w:w="2041"/>
+            <w:tcBorders>
+              <w:top w:val="nil"/>
+              <w:bottom w:val="nil"/>
+              <w:left w:val="nil"/>
+              <w:right w:val="nil"/>
+              <w:insideH w:val="nil"/>
+              <w:insideV w:val="nil"/>
+            </w:tcBorders>
+            <w:vAlign w:val="center"/>
+          </w:tcPr>
+          <w:p>
+            <w:pPr>
+              <w:spacing w:after="60" w:before="0"/>
+              <w:jc w:val="center"/>
+            </w:pPr>
+            <w:r/>
+            <w:r>
+              <w:rPr>
+                <w:rFonts w:ascii="Times New Roman" w:hAnsi="Times New Roman" w:cs="Times New Roman" w:eastAsia="Times New Roman"/>
+                <w:b/>
+                <w:i w:val="0"/>
+                <w:sz w:val="22"/>
+              </w:rPr>
+              <w:t>1.013</w:t>
+            </w:r>
+          </w:p>
+        </w:tc>
+        <w:tc>
+          <w:tcPr>
+            <w:tcW w:type="dxa" w:w="2041"/>
+            <w:tcBorders>
+              <w:top w:val="nil"/>
+              <w:bottom w:val="nil"/>
+              <w:left w:val="nil"/>
+              <w:right w:val="nil"/>
+              <w:insideH w:val="nil"/>
+              <w:insideV w:val="nil"/>
+            </w:tcBorders>
+            <w:vAlign w:val="center"/>
+          </w:tcPr>
+          <w:p>
+            <w:pPr>
+              <w:spacing w:after="60" w:before="0"/>
+              <w:jc w:val="center"/>
+            </w:pPr>
+            <w:r/>
+            <w:r>
+              <w:rPr>
+                <w:rFonts w:ascii="Times New Roman" w:hAnsi="Times New Roman" w:cs="Times New Roman" w:eastAsia="Times New Roman"/>
+                <w:b w:val="0"/>
+                <w:i w:val="0"/>
+                <w:sz w:val="22"/>
+              </w:rPr>
+              <w:t>1.152</w:t>
+            </w:r>
+          </w:p>
+        </w:tc>
+      </w:tr>
+      <w:tr>
+        <w:tc>
+          <w:tcPr>
+            <w:tcW w:type="dxa" w:w="2494"/>
+            <w:tcBorders>
+              <w:top w:val="nil"/>
+              <w:bottom w:val="nil"/>
+              <w:left w:val="nil"/>
+              <w:right w:val="nil"/>
+              <w:insideH w:val="nil"/>
+              <w:insideV w:val="nil"/>
+            </w:tcBorders>
+            <w:vAlign w:val="center"/>
+          </w:tcPr>
+          <w:p>
+            <w:pPr>
+              <w:spacing w:after="60" w:before="0"/>
+              <w:jc w:val="left"/>
+            </w:pPr>
+            <w:r/>
+            <w:r>
+              <w:rPr>
+                <w:rFonts w:ascii="Times New Roman" w:hAnsi="Times New Roman" w:cs="Times New Roman" w:eastAsia="Times New Roman"/>
+                <w:b w:val="0"/>
+                <w:i w:val="0"/>
+                <w:sz w:val="22"/>
+              </w:rPr>
+              <w:t>XGBoost</w:t>
+            </w:r>
+          </w:p>
+        </w:tc>
+        <w:tc>
+          <w:tcPr>
+            <w:tcW w:type="dxa" w:w="2041"/>
+            <w:tcBorders>
+              <w:top w:val="nil"/>
+              <w:bottom w:val="nil"/>
+              <w:left w:val="nil"/>
+              <w:right w:val="nil"/>
+              <w:insideH w:val="nil"/>
+              <w:insideV w:val="nil"/>
+            </w:tcBorders>
+            <w:vAlign w:val="center"/>
+          </w:tcPr>
+          <w:p>
+            <w:pPr>
+              <w:spacing w:after="60" w:before="0"/>
+              <w:jc w:val="center"/>
+            </w:pPr>
+            <w:r/>
+            <w:r>
+              <w:rPr>
+                <w:rFonts w:ascii="Times New Roman" w:hAnsi="Times New Roman" w:cs="Times New Roman" w:eastAsia="Times New Roman"/>
+                <w:b w:val="0"/>
+                <w:i w:val="0"/>
+                <w:sz w:val="22"/>
+              </w:rPr>
+              <w:t>0.835</w:t>
+            </w:r>
+          </w:p>
+        </w:tc>
+        <w:tc>
+          <w:tcPr>
+            <w:tcW w:type="dxa" w:w="2041"/>
+            <w:tcBorders>
+              <w:top w:val="nil"/>
+              <w:bottom w:val="nil"/>
+              <w:left w:val="nil"/>
+              <w:right w:val="nil"/>
+              <w:insideH w:val="nil"/>
+              <w:insideV w:val="nil"/>
+            </w:tcBorders>
+            <w:vAlign w:val="center"/>
+          </w:tcPr>
+          <w:p>
+            <w:pPr>
+              <w:spacing w:after="60" w:before="0"/>
+              <w:jc w:val="center"/>
+            </w:pPr>
+            <w:r/>
+            <w:r>
+              <w:rPr>
+                <w:rFonts w:ascii="Times New Roman" w:hAnsi="Times New Roman" w:cs="Times New Roman" w:eastAsia="Times New Roman"/>
+                <w:b w:val="0"/>
+                <w:i w:val="0"/>
+                <w:sz w:val="22"/>
+              </w:rPr>
+              <w:t>0.705</w:t>
+            </w:r>
+          </w:p>
+        </w:tc>
+        <w:tc>
+          <w:tcPr>
+            <w:tcW w:type="dxa" w:w="2041"/>
+            <w:tcBorders>
+              <w:top w:val="nil"/>
+              <w:bottom w:val="nil"/>
+              <w:left w:val="nil"/>
+              <w:right w:val="nil"/>
+              <w:insideH w:val="nil"/>
+              <w:insideV w:val="nil"/>
+            </w:tcBorders>
+            <w:vAlign w:val="center"/>
+          </w:tcPr>
+          <w:p>
+            <w:pPr>
+              <w:spacing w:after="60" w:before="0"/>
+              <w:jc w:val="center"/>
+            </w:pPr>
+            <w:r/>
+            <w:r>
+              <w:rPr>
+                <w:rFonts w:ascii="Times New Roman" w:hAnsi="Times New Roman" w:cs="Times New Roman" w:eastAsia="Times New Roman"/>
+                <w:b w:val="0"/>
+                <w:i w:val="0"/>
+                <w:sz w:val="22"/>
+              </w:rPr>
+              <w:t>0.053</w:t>
+            </w:r>
+          </w:p>
+        </w:tc>
+        <w:tc>
+          <w:tcPr>
+            <w:tcW w:type="dxa" w:w="2041"/>
+            <w:tcBorders>
+              <w:top w:val="nil"/>
+              <w:bottom w:val="nil"/>
+              <w:left w:val="nil"/>
+              <w:right w:val="nil"/>
+              <w:insideH w:val="nil"/>
+              <w:insideV w:val="nil"/>
+            </w:tcBorders>
+            <w:vAlign w:val="center"/>
+          </w:tcPr>
+          <w:p>
+            <w:pPr>
+              <w:spacing w:after="60" w:before="0"/>
+              <w:jc w:val="center"/>
+            </w:pPr>
+            <w:r/>
+            <w:r>
+              <w:rPr>
+                <w:rFonts w:ascii="Times New Roman" w:hAnsi="Times New Roman" w:cs="Times New Roman" w:eastAsia="Times New Roman"/>
+                <w:b w:val="0"/>
+                <w:i w:val="0"/>
+                <w:sz w:val="22"/>
+              </w:rPr>
+              <w:t>1.288</w:t>
+            </w:r>
+          </w:p>
+        </w:tc>
+        <w:tc>
+          <w:tcPr>
+            <w:tcW w:type="dxa" w:w="2041"/>
+            <w:tcBorders>
+              <w:top w:val="nil"/>
+              <w:bottom w:val="nil"/>
+              <w:left w:val="nil"/>
+              <w:right w:val="nil"/>
+              <w:insideH w:val="nil"/>
+              <w:insideV w:val="nil"/>
+            </w:tcBorders>
+            <w:vAlign w:val="center"/>
+          </w:tcPr>
+          <w:p>
+            <w:pPr>
+              <w:spacing w:after="60" w:before="0"/>
+              <w:jc w:val="center"/>
+            </w:pPr>
+            <w:r/>
+            <w:r>
+              <w:rPr>
+                <w:rFonts w:ascii="Times New Roman" w:hAnsi="Times New Roman" w:cs="Times New Roman" w:eastAsia="Times New Roman"/>
+                <w:b/>
+                <w:i w:val="0"/>
+                <w:sz w:val="22"/>
+              </w:rPr>
+              <w:t>0.963</w:t>
+            </w:r>
+          </w:p>
+        </w:tc>
+      </w:tr>
+      <w:tr>
+        <w:tc>
+          <w:tcPr>
+            <w:tcW w:type="dxa" w:w="2494"/>
+            <w:tcBorders>
+              <w:top w:val="nil"/>
+              <w:bottom w:val="nil"/>
+              <w:left w:val="nil"/>
+              <w:right w:val="nil"/>
+              <w:insideH w:val="nil"/>
+              <w:insideV w:val="nil"/>
+            </w:tcBorders>
+            <w:vAlign w:val="center"/>
+          </w:tcPr>
+          <w:p>
+            <w:pPr>
+              <w:spacing w:after="60" w:before="0"/>
+              <w:jc w:val="left"/>
+            </w:pPr>
+            <w:r/>
+            <w:r>
+              <w:rPr>
+                <w:rFonts w:ascii="Times New Roman" w:hAnsi="Times New Roman" w:cs="Times New Roman" w:eastAsia="Times New Roman"/>
+                <w:b w:val="0"/>
+                <w:i w:val="0"/>
+                <w:sz w:val="22"/>
+              </w:rPr>
+              <w:t>LightGBM</w:t>
+            </w:r>
+          </w:p>
+        </w:tc>
+        <w:tc>
+          <w:tcPr>
+            <w:tcW w:type="dxa" w:w="2041"/>
+            <w:tcBorders>
+              <w:top w:val="nil"/>
+              <w:bottom w:val="nil"/>
+              <w:left w:val="nil"/>
+              <w:right w:val="nil"/>
+              <w:insideH w:val="nil"/>
+              <w:insideV w:val="nil"/>
+            </w:tcBorders>
+            <w:vAlign w:val="center"/>
+          </w:tcPr>
+          <w:p>
+            <w:pPr>
+              <w:spacing w:after="60" w:before="0"/>
+              <w:jc w:val="center"/>
+            </w:pPr>
+            <w:r/>
+            <w:r>
+              <w:rPr>
+                <w:rFonts w:ascii="Times New Roman" w:hAnsi="Times New Roman" w:cs="Times New Roman" w:eastAsia="Times New Roman"/>
+                <w:b w:val="0"/>
+                <w:i w:val="0"/>
+                <w:sz w:val="22"/>
+              </w:rPr>
+              <w:t>0.686</w:t>
+            </w:r>
+          </w:p>
+        </w:tc>
+        <w:tc>
+          <w:tcPr>
+            <w:tcW w:type="dxa" w:w="2041"/>
+            <w:tcBorders>
+              <w:top w:val="nil"/>
+              <w:bottom w:val="nil"/>
+              <w:left w:val="nil"/>
+              <w:right w:val="nil"/>
+              <w:insideH w:val="nil"/>
+              <w:insideV w:val="nil"/>
+            </w:tcBorders>
+            <w:vAlign w:val="center"/>
+          </w:tcPr>
+          <w:p>
+            <w:pPr>
+              <w:spacing w:after="60" w:before="0"/>
+              <w:jc w:val="center"/>
+            </w:pPr>
+            <w:r/>
+            <w:r>
+              <w:rPr>
+                <w:rFonts w:ascii="Times New Roman" w:hAnsi="Times New Roman" w:cs="Times New Roman" w:eastAsia="Times New Roman"/>
+                <w:b/>
+                <w:i w:val="0"/>
+                <w:sz w:val="22"/>
+              </w:rPr>
+              <w:t>0.878</w:t>
+            </w:r>
+          </w:p>
+        </w:tc>
+        <w:tc>
+          <w:tcPr>
+            <w:tcW w:type="dxa" w:w="2041"/>
+            <w:tcBorders>
+              <w:top w:val="nil"/>
+              <w:bottom w:val="nil"/>
+              <w:left w:val="nil"/>
+              <w:right w:val="nil"/>
+              <w:insideH w:val="nil"/>
+              <w:insideV w:val="nil"/>
+            </w:tcBorders>
+            <w:vAlign w:val="center"/>
+          </w:tcPr>
+          <w:p>
+            <w:pPr>
+              <w:spacing w:after="60" w:before="0"/>
+              <w:jc w:val="center"/>
+            </w:pPr>
+            <w:r/>
+            <w:r>
+              <w:rPr>
+                <w:rFonts w:ascii="Times New Roman" w:hAnsi="Times New Roman" w:cs="Times New Roman" w:eastAsia="Times New Roman"/>
+                <w:b w:val="0"/>
+                <w:i w:val="0"/>
+                <w:sz w:val="22"/>
+              </w:rPr>
+              <w:t>0.346</w:t>
+            </w:r>
+          </w:p>
+        </w:tc>
+        <w:tc>
+          <w:tcPr>
+            <w:tcW w:type="dxa" w:w="2041"/>
+            <w:tcBorders>
+              <w:top w:val="nil"/>
+              <w:bottom w:val="nil"/>
+              <w:left w:val="nil"/>
+              <w:right w:val="nil"/>
+              <w:insideH w:val="nil"/>
+              <w:insideV w:val="nil"/>
+            </w:tcBorders>
+            <w:vAlign w:val="center"/>
+          </w:tcPr>
+          <w:p>
+            <w:pPr>
+              <w:spacing w:after="60" w:before="0"/>
+              <w:jc w:val="center"/>
+            </w:pPr>
+            <w:r/>
+            <w:r>
+              <w:rPr>
+                <w:rFonts w:ascii="Times New Roman" w:hAnsi="Times New Roman" w:cs="Times New Roman" w:eastAsia="Times New Roman"/>
+                <w:b w:val="0"/>
+                <w:i w:val="0"/>
+                <w:sz w:val="22"/>
+              </w:rPr>
+              <w:t>1.053</w:t>
+            </w:r>
+          </w:p>
+        </w:tc>
+        <w:tc>
+          <w:tcPr>
+            <w:tcW w:type="dxa" w:w="2041"/>
+            <w:tcBorders>
+              <w:top w:val="nil"/>
+              <w:bottom w:val="nil"/>
+              <w:left w:val="nil"/>
+              <w:right w:val="nil"/>
+              <w:insideH w:val="nil"/>
+              <w:insideV w:val="nil"/>
+            </w:tcBorders>
+            <w:vAlign w:val="center"/>
+          </w:tcPr>
+          <w:p>
+            <w:pPr>
+              <w:spacing w:after="60" w:before="0"/>
+              <w:jc w:val="center"/>
+            </w:pPr>
+            <w:r/>
+            <w:r>
+              <w:rPr>
+                <w:rFonts w:ascii="Times New Roman" w:hAnsi="Times New Roman" w:cs="Times New Roman" w:eastAsia="Times New Roman"/>
+                <w:b w:val="0"/>
+                <w:i w:val="0"/>
+                <w:sz w:val="22"/>
+              </w:rPr>
+              <w:t>0.714</w:t>
             </w:r>
           </w:p>
         </w:tc>
@@ -3087,16 +3229,7 @@
                 <w:i/>
                 <w:sz w:val="22"/>
               </w:rPr>
-              <w:t>Brier 0.166</w:t>
-            </w:r>
-            <w:r>
-              <w:rPr>
-                <w:rFonts w:ascii="Times New Roman" w:hAnsi="Times New Roman" w:cs="Times New Roman" w:eastAsia="Times New Roman"/>
-                <w:b w:val="0"/>
-                <w:i/>
-                <w:sz w:val="18"/>
-              </w:rPr>
-              <w:t xml:space="preserve"> (Cal 0.747)</w:t>
+              <w:t>0.747</w:t>
             </w:r>
           </w:p>
         </w:tc>
@@ -3126,16 +3259,7 @@
                 <w:i/>
                 <w:sz w:val="22"/>
               </w:rPr>
-              <w:t>Brier 0.230</w:t>
-            </w:r>
-            <w:r>
-              <w:rPr>
-                <w:rFonts w:ascii="Times New Roman" w:hAnsi="Times New Roman" w:cs="Times New Roman" w:eastAsia="Times New Roman"/>
-                <w:b w:val="0"/>
-                <w:i/>
-                <w:sz w:val="18"/>
-              </w:rPr>
-              <w:t xml:space="preserve"> (Cal 0.734)</w:t>
+              <w:t>0.734</w:t>
             </w:r>
           </w:p>
         </w:tc>
@@ -3165,16 +3289,7 @@
                 <w:i/>
                 <w:sz w:val="22"/>
               </w:rPr>
-              <w:t>Brier 0.251</w:t>
-            </w:r>
-            <w:r>
-              <w:rPr>
-                <w:rFonts w:ascii="Times New Roman" w:hAnsi="Times New Roman" w:cs="Times New Roman" w:eastAsia="Times New Roman"/>
-                <w:b w:val="0"/>
-                <w:i/>
-                <w:sz w:val="18"/>
-              </w:rPr>
-              <w:t xml:space="preserve"> (Cal 0.190)</w:t>
+              <w:t>0.190</w:t>
             </w:r>
           </w:p>
         </w:tc>
@@ -3204,16 +3319,7 @@
                 <w:i/>
                 <w:sz w:val="22"/>
               </w:rPr>
-              <w:t>Brier 0.100</w:t>
-            </w:r>
-            <w:r>
-              <w:rPr>
-                <w:rFonts w:ascii="Times New Roman" w:hAnsi="Times New Roman" w:cs="Times New Roman" w:eastAsia="Times New Roman"/>
-                <w:b w:val="0"/>
-                <w:i/>
-                <w:sz w:val="18"/>
-              </w:rPr>
-              <w:t xml:space="preserve"> (Cal 0.891)</w:t>
+              <w:t>0.891</w:t>
             </w:r>
           </w:p>
         </w:tc>
@@ -3243,16 +3349,7 @@
                 <w:i/>
                 <w:sz w:val="22"/>
               </w:rPr>
-              <w:t>Brier 0.122</w:t>
-            </w:r>
-            <w:r>
-              <w:rPr>
-                <w:rFonts w:ascii="Times New Roman" w:hAnsi="Times New Roman" w:cs="Times New Roman" w:eastAsia="Times New Roman"/>
-                <w:b w:val="0"/>
-                <w:i/>
-                <w:sz w:val="18"/>
-              </w:rPr>
-              <w:t xml:space="preserve"> (Cal 0.904)</w:t>
+              <w:t>0.904</w:t>
             </w:r>
           </w:p>
         </w:tc>
@@ -3269,7 +3366,7 @@
           <w:i/>
           <w:sz w:val="18"/>
         </w:rPr>
-        <w:t>Bold Brier score = lowest (best) in that column among the four main classifiers. Bold calibration slope = closest to the ideal value of 1.0 in that column among the four main classifiers (independent criterion from Brier score). TabPFN v3 shown in italics for reference; not included in formal pairwise significance testing (DeLong's test) or bootstrap correction.</w:t>
+        <w:t>TabPFN v3 shown in italics for reference throughout; not included in formal pairwise significance testing (DeLong's test) or bootstrap correction.</w:t>
       </w:r>
     </w:p>
     <w:p>
@@ -3283,7 +3380,7 @@
           <w:i/>
           <w:sz w:val="18"/>
         </w:rPr>
-        <w:t>Serial Biopsy calibration is degenerate for all five models at this sample size (e.g. XGBoost slope=0.053 reflects near-constant predictions, not a data error) — these values should not be compared against the other cohorts at face value.</w:t>
+        <w:t>Serial Biopsy (all three panels) should be treated as exploratory: n=70 (34 events) produces wide confidence intervals in panel (a) and degenerate calibration in panels (b)/(c) (e.g. XGBoost's slope of 0.053 reflects near-constant predictions, not a data error) — this cohort is formally underpowered by standard minimum sample-size criteria for prediction model development (Riley et al. 2020, BMJ 368:m441).</w:t>
       </w:r>
     </w:p>
     <w:sectPr>

</xml_diff>

<commit_message>
Fit table to one page: shorten TabPFN label, narrower columns, prevent page breaks
1. 'TabPFN v3 (Prior Labs)' -> 'TabPFN v3' in all three panels.
2. Model column 4.4->3.8cm, five data columns 3.6->2.62cm each (fits
   'Logistic Regression' on one line).
3. Every row: <w:cantSplit/> so it can't split across a page break (no
   native python-docx 'allow_break_across_pages' attribute exists in
   1.2.0 - verified - so this is set via direct OOXML). keep_with_next=True
   on every paragraph in every row except the last, and on the caption.
4. Panel sub-header space_before: 6pt (120 dxa) -> 3pt (60 dxa).

Also fixes a real bug this surfaced: column widths were being set only
via per-cell .width, which does NOT update the table's tblGrid and
silently renders as a uniform default width in Word - verified empirically
with a minimal repro. Now sets both table.columns[i].width (grid) and
per-cell width, confirmed correct on readback. No data values, bolding
logic, or footnote text changed.
</commit_message>
<xml_diff>
--- a/outputs/Tables_1_2_Publication.docx
+++ b/outputs/Tables_1_2_Publication.docx
@@ -4,6 +4,7 @@
   <w:body>
     <w:p>
       <w:pPr>
+        <w:keepNext/>
         <w:spacing w:after="160"/>
       </w:pPr>
       <w:r>
@@ -31,17 +32,20 @@
         </w:tblCellMar>
       </w:tblPr>
       <w:tblGrid>
-        <w:gridCol w:w="2168"/>
-        <w:gridCol w:w="2168"/>
-        <w:gridCol w:w="2168"/>
-        <w:gridCol w:w="2168"/>
-        <w:gridCol w:w="2168"/>
-        <w:gridCol w:w="2168"/>
+        <w:gridCol w:w="2154"/>
+        <w:gridCol w:w="1485"/>
+        <w:gridCol w:w="1485"/>
+        <w:gridCol w:w="1485"/>
+        <w:gridCol w:w="1485"/>
+        <w:gridCol w:w="1485"/>
       </w:tblGrid>
       <w:tr>
+        <w:trPr>
+          <w:cantSplit/>
+        </w:trPr>
         <w:tc>
           <w:tcPr>
-            <w:tcW w:type="dxa" w:w="2494"/>
+            <w:tcW w:type="dxa" w:w="2154"/>
             <w:vMerge w:val="restart"/>
             <w:tcBorders>
               <w:top w:val="nil" w:sz="18" w:color="000000" w:space="0"/>
@@ -55,6 +59,7 @@
           </w:tcPr>
           <w:p>
             <w:pPr>
+              <w:keepNext/>
               <w:spacing w:after="60" w:before="0"/>
               <w:jc w:val="left"/>
             </w:pPr>
@@ -72,7 +77,7 @@
         </w:tc>
         <w:tc>
           <w:tcPr>
-            <w:tcW w:type="dxa" w:w="6123"/>
+            <w:tcW w:type="dxa" w:w="4455"/>
             <w:gridSpan w:val="3"/>
             <w:tcBorders>
               <w:top w:val="single" w:sz="18" w:color="000000" w:space="0"/>
@@ -86,6 +91,7 @@
           </w:tcPr>
           <w:p>
             <w:pPr>
+              <w:keepNext/>
               <w:spacing w:after="60" w:before="0"/>
               <w:jc w:val="center"/>
             </w:pPr>
@@ -103,7 +109,7 @@
         </w:tc>
         <w:tc>
           <w:tcPr>
-            <w:tcW w:type="dxa" w:w="4082"/>
+            <w:tcW w:type="dxa" w:w="2970"/>
             <w:gridSpan w:val="2"/>
             <w:tcBorders>
               <w:top w:val="single" w:sz="18" w:color="000000" w:space="0"/>
@@ -117,6 +123,7 @@
           </w:tcPr>
           <w:p>
             <w:pPr>
+              <w:keepNext/>
               <w:spacing w:after="60" w:before="0"/>
               <w:jc w:val="center"/>
             </w:pPr>
@@ -134,9 +141,12 @@
         </w:tc>
       </w:tr>
       <w:tr>
+        <w:trPr>
+          <w:cantSplit/>
+        </w:trPr>
         <w:tc>
           <w:tcPr>
-            <w:tcW w:type="dxa" w:w="2494"/>
+            <w:tcW w:type="dxa" w:w="2154"/>
             <w:vMerge/>
             <w:tcBorders>
               <w:top w:val="nil"/>
@@ -151,7 +161,7 @@
         </w:tc>
         <w:tc>
           <w:tcPr>
-            <w:tcW w:type="dxa" w:w="2041"/>
+            <w:tcW w:type="dxa" w:w="1485"/>
             <w:tcBorders>
               <w:top w:val="nil"/>
               <w:bottom w:val="single" w:sz="8" w:color="000000" w:space="0"/>
@@ -164,6 +174,7 @@
           </w:tcPr>
           <w:p>
             <w:pPr>
+              <w:keepNext/>
               <w:spacing w:after="60" w:before="0"/>
               <w:jc w:val="center"/>
             </w:pPr>
@@ -181,7 +192,7 @@
         </w:tc>
         <w:tc>
           <w:tcPr>
-            <w:tcW w:type="dxa" w:w="2041"/>
+            <w:tcW w:type="dxa" w:w="1485"/>
             <w:tcBorders>
               <w:top w:val="nil"/>
               <w:bottom w:val="single" w:sz="8" w:color="000000" w:space="0"/>
@@ -194,6 +205,7 @@
           </w:tcPr>
           <w:p>
             <w:pPr>
+              <w:keepNext/>
               <w:spacing w:after="60" w:before="0"/>
               <w:jc w:val="center"/>
             </w:pPr>
@@ -211,7 +223,7 @@
         </w:tc>
         <w:tc>
           <w:tcPr>
-            <w:tcW w:type="dxa" w:w="2041"/>
+            <w:tcW w:type="dxa" w:w="1485"/>
             <w:tcBorders>
               <w:top w:val="nil"/>
               <w:bottom w:val="single" w:sz="8" w:color="000000" w:space="0"/>
@@ -224,6 +236,7 @@
           </w:tcPr>
           <w:p>
             <w:pPr>
+              <w:keepNext/>
               <w:spacing w:after="60" w:before="0"/>
               <w:jc w:val="center"/>
             </w:pPr>
@@ -241,7 +254,7 @@
         </w:tc>
         <w:tc>
           <w:tcPr>
-            <w:tcW w:type="dxa" w:w="2041"/>
+            <w:tcW w:type="dxa" w:w="1485"/>
             <w:tcBorders>
               <w:top w:val="nil"/>
               <w:bottom w:val="single" w:sz="8" w:color="000000" w:space="0"/>
@@ -254,6 +267,7 @@
           </w:tcPr>
           <w:p>
             <w:pPr>
+              <w:keepNext/>
               <w:spacing w:after="60" w:before="0"/>
               <w:jc w:val="center"/>
             </w:pPr>
@@ -271,7 +285,7 @@
         </w:tc>
         <w:tc>
           <w:tcPr>
-            <w:tcW w:type="dxa" w:w="2041"/>
+            <w:tcW w:type="dxa" w:w="1485"/>
             <w:tcBorders>
               <w:top w:val="nil"/>
               <w:bottom w:val="single" w:sz="8" w:color="000000" w:space="0"/>
@@ -284,6 +298,7 @@
           </w:tcPr>
           <w:p>
             <w:pPr>
+              <w:keepNext/>
               <w:spacing w:after="60" w:before="0"/>
               <w:jc w:val="center"/>
             </w:pPr>
@@ -301,9 +316,12 @@
         </w:tc>
       </w:tr>
       <w:tr>
+        <w:trPr>
+          <w:cantSplit/>
+        </w:trPr>
         <w:tc>
           <w:tcPr>
-            <w:tcW w:type="dxa" w:w="12699"/>
+            <w:tcW w:type="dxa" w:w="9579"/>
             <w:gridSpan w:val="6"/>
             <w:tcBorders>
               <w:top w:val="nil"/>
@@ -317,7 +335,8 @@
           </w:tcPr>
           <w:p>
             <w:pPr>
-              <w:spacing w:after="60" w:before="120"/>
+              <w:keepNext/>
+              <w:spacing w:after="60" w:before="60"/>
               <w:jc w:val="left"/>
             </w:pPr>
             <w:r/>
@@ -334,9 +353,12 @@
         </w:tc>
       </w:tr>
       <w:tr>
+        <w:trPr>
+          <w:cantSplit/>
+        </w:trPr>
         <w:tc>
           <w:tcPr>
-            <w:tcW w:type="dxa" w:w="2494"/>
+            <w:tcW w:type="dxa" w:w="2154"/>
             <w:tcBorders>
               <w:top w:val="nil"/>
               <w:bottom w:val="nil"/>
@@ -349,6 +371,7 @@
           </w:tcPr>
           <w:p>
             <w:pPr>
+              <w:keepNext/>
               <w:spacing w:after="60" w:before="0"/>
               <w:jc w:val="left"/>
             </w:pPr>
@@ -366,7 +389,7 @@
         </w:tc>
         <w:tc>
           <w:tcPr>
-            <w:tcW w:type="dxa" w:w="2041"/>
+            <w:tcW w:type="dxa" w:w="1485"/>
             <w:tcBorders>
               <w:top w:val="nil"/>
               <w:bottom w:val="nil"/>
@@ -379,6 +402,7 @@
           </w:tcPr>
           <w:p>
             <w:pPr>
+              <w:keepNext/>
               <w:spacing w:after="60" w:before="0"/>
               <w:jc w:val="center"/>
             </w:pPr>
@@ -405,7 +429,7 @@
         </w:tc>
         <w:tc>
           <w:tcPr>
-            <w:tcW w:type="dxa" w:w="2041"/>
+            <w:tcW w:type="dxa" w:w="1485"/>
             <w:tcBorders>
               <w:top w:val="nil"/>
               <w:bottom w:val="nil"/>
@@ -418,6 +442,7 @@
           </w:tcPr>
           <w:p>
             <w:pPr>
+              <w:keepNext/>
               <w:spacing w:after="60" w:before="0"/>
               <w:jc w:val="center"/>
             </w:pPr>
@@ -444,7 +469,7 @@
         </w:tc>
         <w:tc>
           <w:tcPr>
-            <w:tcW w:type="dxa" w:w="2041"/>
+            <w:tcW w:type="dxa" w:w="1485"/>
             <w:tcBorders>
               <w:top w:val="nil"/>
               <w:bottom w:val="nil"/>
@@ -457,6 +482,7 @@
           </w:tcPr>
           <w:p>
             <w:pPr>
+              <w:keepNext/>
               <w:spacing w:after="60" w:before="0"/>
               <w:jc w:val="center"/>
             </w:pPr>
@@ -483,7 +509,7 @@
         </w:tc>
         <w:tc>
           <w:tcPr>
-            <w:tcW w:type="dxa" w:w="2041"/>
+            <w:tcW w:type="dxa" w:w="1485"/>
             <w:tcBorders>
               <w:top w:val="nil"/>
               <w:bottom w:val="nil"/>
@@ -496,6 +522,7 @@
           </w:tcPr>
           <w:p>
             <w:pPr>
+              <w:keepNext/>
               <w:spacing w:after="60" w:before="0"/>
               <w:jc w:val="center"/>
             </w:pPr>
@@ -522,7 +549,7 @@
         </w:tc>
         <w:tc>
           <w:tcPr>
-            <w:tcW w:type="dxa" w:w="2041"/>
+            <w:tcW w:type="dxa" w:w="1485"/>
             <w:tcBorders>
               <w:top w:val="nil"/>
               <w:bottom w:val="nil"/>
@@ -535,6 +562,7 @@
           </w:tcPr>
           <w:p>
             <w:pPr>
+              <w:keepNext/>
               <w:spacing w:after="60" w:before="0"/>
               <w:jc w:val="center"/>
             </w:pPr>
@@ -561,9 +589,12 @@
         </w:tc>
       </w:tr>
       <w:tr>
+        <w:trPr>
+          <w:cantSplit/>
+        </w:trPr>
         <w:tc>
           <w:tcPr>
-            <w:tcW w:type="dxa" w:w="2494"/>
+            <w:tcW w:type="dxa" w:w="2154"/>
             <w:tcBorders>
               <w:top w:val="nil"/>
               <w:bottom w:val="nil"/>
@@ -576,6 +607,7 @@
           </w:tcPr>
           <w:p>
             <w:pPr>
+              <w:keepNext/>
               <w:spacing w:after="60" w:before="0"/>
               <w:jc w:val="left"/>
             </w:pPr>
@@ -593,7 +625,7 @@
         </w:tc>
         <w:tc>
           <w:tcPr>
-            <w:tcW w:type="dxa" w:w="2041"/>
+            <w:tcW w:type="dxa" w:w="1485"/>
             <w:tcBorders>
               <w:top w:val="nil"/>
               <w:bottom w:val="nil"/>
@@ -606,6 +638,7 @@
           </w:tcPr>
           <w:p>
             <w:pPr>
+              <w:keepNext/>
               <w:spacing w:after="60" w:before="0"/>
               <w:jc w:val="center"/>
             </w:pPr>
@@ -632,7 +665,7 @@
         </w:tc>
         <w:tc>
           <w:tcPr>
-            <w:tcW w:type="dxa" w:w="2041"/>
+            <w:tcW w:type="dxa" w:w="1485"/>
             <w:tcBorders>
               <w:top w:val="nil"/>
               <w:bottom w:val="nil"/>
@@ -645,6 +678,7 @@
           </w:tcPr>
           <w:p>
             <w:pPr>
+              <w:keepNext/>
               <w:spacing w:after="60" w:before="0"/>
               <w:jc w:val="center"/>
             </w:pPr>
@@ -671,7 +705,7 @@
         </w:tc>
         <w:tc>
           <w:tcPr>
-            <w:tcW w:type="dxa" w:w="2041"/>
+            <w:tcW w:type="dxa" w:w="1485"/>
             <w:tcBorders>
               <w:top w:val="nil"/>
               <w:bottom w:val="nil"/>
@@ -684,6 +718,7 @@
           </w:tcPr>
           <w:p>
             <w:pPr>
+              <w:keepNext/>
               <w:spacing w:after="60" w:before="0"/>
               <w:jc w:val="center"/>
             </w:pPr>
@@ -710,7 +745,7 @@
         </w:tc>
         <w:tc>
           <w:tcPr>
-            <w:tcW w:type="dxa" w:w="2041"/>
+            <w:tcW w:type="dxa" w:w="1485"/>
             <w:tcBorders>
               <w:top w:val="nil"/>
               <w:bottom w:val="nil"/>
@@ -723,6 +758,7 @@
           </w:tcPr>
           <w:p>
             <w:pPr>
+              <w:keepNext/>
               <w:spacing w:after="60" w:before="0"/>
               <w:jc w:val="center"/>
             </w:pPr>
@@ -749,7 +785,7 @@
         </w:tc>
         <w:tc>
           <w:tcPr>
-            <w:tcW w:type="dxa" w:w="2041"/>
+            <w:tcW w:type="dxa" w:w="1485"/>
             <w:tcBorders>
               <w:top w:val="nil"/>
               <w:bottom w:val="nil"/>
@@ -762,6 +798,7 @@
           </w:tcPr>
           <w:p>
             <w:pPr>
+              <w:keepNext/>
               <w:spacing w:after="60" w:before="0"/>
               <w:jc w:val="center"/>
             </w:pPr>
@@ -788,9 +825,12 @@
         </w:tc>
       </w:tr>
       <w:tr>
+        <w:trPr>
+          <w:cantSplit/>
+        </w:trPr>
         <w:tc>
           <w:tcPr>
-            <w:tcW w:type="dxa" w:w="2494"/>
+            <w:tcW w:type="dxa" w:w="2154"/>
             <w:tcBorders>
               <w:top w:val="nil"/>
               <w:bottom w:val="nil"/>
@@ -803,6 +843,7 @@
           </w:tcPr>
           <w:p>
             <w:pPr>
+              <w:keepNext/>
               <w:spacing w:after="60" w:before="0"/>
               <w:jc w:val="left"/>
             </w:pPr>
@@ -820,7 +861,7 @@
         </w:tc>
         <w:tc>
           <w:tcPr>
-            <w:tcW w:type="dxa" w:w="2041"/>
+            <w:tcW w:type="dxa" w:w="1485"/>
             <w:tcBorders>
               <w:top w:val="nil"/>
               <w:bottom w:val="nil"/>
@@ -833,6 +874,7 @@
           </w:tcPr>
           <w:p>
             <w:pPr>
+              <w:keepNext/>
               <w:spacing w:after="60" w:before="0"/>
               <w:jc w:val="center"/>
             </w:pPr>
@@ -859,7 +901,7 @@
         </w:tc>
         <w:tc>
           <w:tcPr>
-            <w:tcW w:type="dxa" w:w="2041"/>
+            <w:tcW w:type="dxa" w:w="1485"/>
             <w:tcBorders>
               <w:top w:val="nil"/>
               <w:bottom w:val="nil"/>
@@ -872,6 +914,7 @@
           </w:tcPr>
           <w:p>
             <w:pPr>
+              <w:keepNext/>
               <w:spacing w:after="60" w:before="0"/>
               <w:jc w:val="center"/>
             </w:pPr>
@@ -898,7 +941,7 @@
         </w:tc>
         <w:tc>
           <w:tcPr>
-            <w:tcW w:type="dxa" w:w="2041"/>
+            <w:tcW w:type="dxa" w:w="1485"/>
             <w:tcBorders>
               <w:top w:val="nil"/>
               <w:bottom w:val="nil"/>
@@ -911,6 +954,7 @@
           </w:tcPr>
           <w:p>
             <w:pPr>
+              <w:keepNext/>
               <w:spacing w:after="60" w:before="0"/>
               <w:jc w:val="center"/>
             </w:pPr>
@@ -937,7 +981,7 @@
         </w:tc>
         <w:tc>
           <w:tcPr>
-            <w:tcW w:type="dxa" w:w="2041"/>
+            <w:tcW w:type="dxa" w:w="1485"/>
             <w:tcBorders>
               <w:top w:val="nil"/>
               <w:bottom w:val="nil"/>
@@ -950,6 +994,7 @@
           </w:tcPr>
           <w:p>
             <w:pPr>
+              <w:keepNext/>
               <w:spacing w:after="60" w:before="0"/>
               <w:jc w:val="center"/>
             </w:pPr>
@@ -976,7 +1021,7 @@
         </w:tc>
         <w:tc>
           <w:tcPr>
-            <w:tcW w:type="dxa" w:w="2041"/>
+            <w:tcW w:type="dxa" w:w="1485"/>
             <w:tcBorders>
               <w:top w:val="nil"/>
               <w:bottom w:val="nil"/>
@@ -989,6 +1034,7 @@
           </w:tcPr>
           <w:p>
             <w:pPr>
+              <w:keepNext/>
               <w:spacing w:after="60" w:before="0"/>
               <w:jc w:val="center"/>
             </w:pPr>
@@ -1015,9 +1061,12 @@
         </w:tc>
       </w:tr>
       <w:tr>
+        <w:trPr>
+          <w:cantSplit/>
+        </w:trPr>
         <w:tc>
           <w:tcPr>
-            <w:tcW w:type="dxa" w:w="2494"/>
+            <w:tcW w:type="dxa" w:w="2154"/>
             <w:tcBorders>
               <w:top w:val="nil"/>
               <w:bottom w:val="nil"/>
@@ -1030,6 +1079,7 @@
           </w:tcPr>
           <w:p>
             <w:pPr>
+              <w:keepNext/>
               <w:spacing w:after="60" w:before="0"/>
               <w:jc w:val="left"/>
             </w:pPr>
@@ -1047,7 +1097,7 @@
         </w:tc>
         <w:tc>
           <w:tcPr>
-            <w:tcW w:type="dxa" w:w="2041"/>
+            <w:tcW w:type="dxa" w:w="1485"/>
             <w:tcBorders>
               <w:top w:val="nil"/>
               <w:bottom w:val="nil"/>
@@ -1060,6 +1110,7 @@
           </w:tcPr>
           <w:p>
             <w:pPr>
+              <w:keepNext/>
               <w:spacing w:after="60" w:before="0"/>
               <w:jc w:val="center"/>
             </w:pPr>
@@ -1086,7 +1137,7 @@
         </w:tc>
         <w:tc>
           <w:tcPr>
-            <w:tcW w:type="dxa" w:w="2041"/>
+            <w:tcW w:type="dxa" w:w="1485"/>
             <w:tcBorders>
               <w:top w:val="nil"/>
               <w:bottom w:val="nil"/>
@@ -1099,6 +1150,7 @@
           </w:tcPr>
           <w:p>
             <w:pPr>
+              <w:keepNext/>
               <w:spacing w:after="60" w:before="0"/>
               <w:jc w:val="center"/>
             </w:pPr>
@@ -1125,7 +1177,7 @@
         </w:tc>
         <w:tc>
           <w:tcPr>
-            <w:tcW w:type="dxa" w:w="2041"/>
+            <w:tcW w:type="dxa" w:w="1485"/>
             <w:tcBorders>
               <w:top w:val="nil"/>
               <w:bottom w:val="nil"/>
@@ -1138,6 +1190,7 @@
           </w:tcPr>
           <w:p>
             <w:pPr>
+              <w:keepNext/>
               <w:spacing w:after="60" w:before="0"/>
               <w:jc w:val="center"/>
             </w:pPr>
@@ -1164,7 +1217,7 @@
         </w:tc>
         <w:tc>
           <w:tcPr>
-            <w:tcW w:type="dxa" w:w="2041"/>
+            <w:tcW w:type="dxa" w:w="1485"/>
             <w:tcBorders>
               <w:top w:val="nil"/>
               <w:bottom w:val="nil"/>
@@ -1177,6 +1230,7 @@
           </w:tcPr>
           <w:p>
             <w:pPr>
+              <w:keepNext/>
               <w:spacing w:after="60" w:before="0"/>
               <w:jc w:val="center"/>
             </w:pPr>
@@ -1203,7 +1257,7 @@
         </w:tc>
         <w:tc>
           <w:tcPr>
-            <w:tcW w:type="dxa" w:w="2041"/>
+            <w:tcW w:type="dxa" w:w="1485"/>
             <w:tcBorders>
               <w:top w:val="nil"/>
               <w:bottom w:val="nil"/>
@@ -1216,6 +1270,7 @@
           </w:tcPr>
           <w:p>
             <w:pPr>
+              <w:keepNext/>
               <w:spacing w:after="60" w:before="0"/>
               <w:jc w:val="center"/>
             </w:pPr>
@@ -1242,9 +1297,12 @@
         </w:tc>
       </w:tr>
       <w:tr>
+        <w:trPr>
+          <w:cantSplit/>
+        </w:trPr>
         <w:tc>
           <w:tcPr>
-            <w:tcW w:type="dxa" w:w="2494"/>
+            <w:tcW w:type="dxa" w:w="2154"/>
             <w:tcBorders>
               <w:top w:val="nil"/>
               <w:bottom w:val="nil"/>
@@ -1257,6 +1315,7 @@
           </w:tcPr>
           <w:p>
             <w:pPr>
+              <w:keepNext/>
               <w:spacing w:after="60" w:before="0"/>
               <w:jc w:val="left"/>
             </w:pPr>
@@ -1268,13 +1327,13 @@
                 <w:i/>
                 <w:sz w:val="21"/>
               </w:rPr>
-              <w:t>TabPFN v3 (Prior Labs)</w:t>
+              <w:t>TabPFN v3</w:t>
             </w:r>
           </w:p>
         </w:tc>
         <w:tc>
           <w:tcPr>
-            <w:tcW w:type="dxa" w:w="2041"/>
+            <w:tcW w:type="dxa" w:w="1485"/>
             <w:tcBorders>
               <w:top w:val="nil"/>
               <w:bottom w:val="nil"/>
@@ -1287,6 +1346,7 @@
           </w:tcPr>
           <w:p>
             <w:pPr>
+              <w:keepNext/>
               <w:spacing w:after="60" w:before="0"/>
               <w:jc w:val="center"/>
             </w:pPr>
@@ -1313,7 +1373,7 @@
         </w:tc>
         <w:tc>
           <w:tcPr>
-            <w:tcW w:type="dxa" w:w="2041"/>
+            <w:tcW w:type="dxa" w:w="1485"/>
             <w:tcBorders>
               <w:top w:val="nil"/>
               <w:bottom w:val="nil"/>
@@ -1326,6 +1386,7 @@
           </w:tcPr>
           <w:p>
             <w:pPr>
+              <w:keepNext/>
               <w:spacing w:after="60" w:before="0"/>
               <w:jc w:val="center"/>
             </w:pPr>
@@ -1352,7 +1413,7 @@
         </w:tc>
         <w:tc>
           <w:tcPr>
-            <w:tcW w:type="dxa" w:w="2041"/>
+            <w:tcW w:type="dxa" w:w="1485"/>
             <w:tcBorders>
               <w:top w:val="nil"/>
               <w:bottom w:val="nil"/>
@@ -1365,6 +1426,7 @@
           </w:tcPr>
           <w:p>
             <w:pPr>
+              <w:keepNext/>
               <w:spacing w:after="60" w:before="0"/>
               <w:jc w:val="center"/>
             </w:pPr>
@@ -1391,7 +1453,7 @@
         </w:tc>
         <w:tc>
           <w:tcPr>
-            <w:tcW w:type="dxa" w:w="2041"/>
+            <w:tcW w:type="dxa" w:w="1485"/>
             <w:tcBorders>
               <w:top w:val="nil"/>
               <w:bottom w:val="nil"/>
@@ -1404,6 +1466,7 @@
           </w:tcPr>
           <w:p>
             <w:pPr>
+              <w:keepNext/>
               <w:spacing w:after="60" w:before="0"/>
               <w:jc w:val="center"/>
             </w:pPr>
@@ -1430,7 +1493,7 @@
         </w:tc>
         <w:tc>
           <w:tcPr>
-            <w:tcW w:type="dxa" w:w="2041"/>
+            <w:tcW w:type="dxa" w:w="1485"/>
             <w:tcBorders>
               <w:top w:val="nil"/>
               <w:bottom w:val="nil"/>
@@ -1443,6 +1506,7 @@
           </w:tcPr>
           <w:p>
             <w:pPr>
+              <w:keepNext/>
               <w:spacing w:after="60" w:before="0"/>
               <w:jc w:val="center"/>
             </w:pPr>
@@ -1469,9 +1533,12 @@
         </w:tc>
       </w:tr>
       <w:tr>
+        <w:trPr>
+          <w:cantSplit/>
+        </w:trPr>
         <w:tc>
           <w:tcPr>
-            <w:tcW w:type="dxa" w:w="12699"/>
+            <w:tcW w:type="dxa" w:w="9579"/>
             <w:gridSpan w:val="6"/>
             <w:tcBorders>
               <w:top w:val="nil"/>
@@ -1485,7 +1552,8 @@
           </w:tcPr>
           <w:p>
             <w:pPr>
-              <w:spacing w:after="60" w:before="120"/>
+              <w:keepNext/>
+              <w:spacing w:after="60" w:before="60"/>
               <w:jc w:val="left"/>
             </w:pPr>
             <w:r/>
@@ -1502,9 +1570,12 @@
         </w:tc>
       </w:tr>
       <w:tr>
+        <w:trPr>
+          <w:cantSplit/>
+        </w:trPr>
         <w:tc>
           <w:tcPr>
-            <w:tcW w:type="dxa" w:w="2494"/>
+            <w:tcW w:type="dxa" w:w="2154"/>
             <w:tcBorders>
               <w:top w:val="nil"/>
               <w:bottom w:val="nil"/>
@@ -1517,6 +1588,7 @@
           </w:tcPr>
           <w:p>
             <w:pPr>
+              <w:keepNext/>
               <w:spacing w:after="60" w:before="0"/>
               <w:jc w:val="left"/>
             </w:pPr>
@@ -1534,7 +1606,7 @@
         </w:tc>
         <w:tc>
           <w:tcPr>
-            <w:tcW w:type="dxa" w:w="2041"/>
+            <w:tcW w:type="dxa" w:w="1485"/>
             <w:tcBorders>
               <w:top w:val="nil"/>
               <w:bottom w:val="nil"/>
@@ -1547,6 +1619,7 @@
           </w:tcPr>
           <w:p>
             <w:pPr>
+              <w:keepNext/>
               <w:spacing w:after="60" w:before="0"/>
               <w:jc w:val="center"/>
             </w:pPr>
@@ -1564,7 +1637,7 @@
         </w:tc>
         <w:tc>
           <w:tcPr>
-            <w:tcW w:type="dxa" w:w="2041"/>
+            <w:tcW w:type="dxa" w:w="1485"/>
             <w:tcBorders>
               <w:top w:val="nil"/>
               <w:bottom w:val="nil"/>
@@ -1577,6 +1650,7 @@
           </w:tcPr>
           <w:p>
             <w:pPr>
+              <w:keepNext/>
               <w:spacing w:after="60" w:before="0"/>
               <w:jc w:val="center"/>
             </w:pPr>
@@ -1594,7 +1668,7 @@
         </w:tc>
         <w:tc>
           <w:tcPr>
-            <w:tcW w:type="dxa" w:w="2041"/>
+            <w:tcW w:type="dxa" w:w="1485"/>
             <w:tcBorders>
               <w:top w:val="nil"/>
               <w:bottom w:val="nil"/>
@@ -1607,6 +1681,7 @@
           </w:tcPr>
           <w:p>
             <w:pPr>
+              <w:keepNext/>
               <w:spacing w:after="60" w:before="0"/>
               <w:jc w:val="center"/>
             </w:pPr>
@@ -1624,7 +1699,7 @@
         </w:tc>
         <w:tc>
           <w:tcPr>
-            <w:tcW w:type="dxa" w:w="2041"/>
+            <w:tcW w:type="dxa" w:w="1485"/>
             <w:tcBorders>
               <w:top w:val="nil"/>
               <w:bottom w:val="nil"/>
@@ -1637,6 +1712,7 @@
           </w:tcPr>
           <w:p>
             <w:pPr>
+              <w:keepNext/>
               <w:spacing w:after="60" w:before="0"/>
               <w:jc w:val="center"/>
             </w:pPr>
@@ -1654,7 +1730,7 @@
         </w:tc>
         <w:tc>
           <w:tcPr>
-            <w:tcW w:type="dxa" w:w="2041"/>
+            <w:tcW w:type="dxa" w:w="1485"/>
             <w:tcBorders>
               <w:top w:val="nil"/>
               <w:bottom w:val="nil"/>
@@ -1667,6 +1743,7 @@
           </w:tcPr>
           <w:p>
             <w:pPr>
+              <w:keepNext/>
               <w:spacing w:after="60" w:before="0"/>
               <w:jc w:val="center"/>
             </w:pPr>
@@ -1684,9 +1761,12 @@
         </w:tc>
       </w:tr>
       <w:tr>
+        <w:trPr>
+          <w:cantSplit/>
+        </w:trPr>
         <w:tc>
           <w:tcPr>
-            <w:tcW w:type="dxa" w:w="2494"/>
+            <w:tcW w:type="dxa" w:w="2154"/>
             <w:tcBorders>
               <w:top w:val="nil"/>
               <w:bottom w:val="nil"/>
@@ -1699,6 +1779,7 @@
           </w:tcPr>
           <w:p>
             <w:pPr>
+              <w:keepNext/>
               <w:spacing w:after="60" w:before="0"/>
               <w:jc w:val="left"/>
             </w:pPr>
@@ -1716,7 +1797,7 @@
         </w:tc>
         <w:tc>
           <w:tcPr>
-            <w:tcW w:type="dxa" w:w="2041"/>
+            <w:tcW w:type="dxa" w:w="1485"/>
             <w:tcBorders>
               <w:top w:val="nil"/>
               <w:bottom w:val="nil"/>
@@ -1729,6 +1810,7 @@
           </w:tcPr>
           <w:p>
             <w:pPr>
+              <w:keepNext/>
               <w:spacing w:after="60" w:before="0"/>
               <w:jc w:val="center"/>
             </w:pPr>
@@ -1746,7 +1828,7 @@
         </w:tc>
         <w:tc>
           <w:tcPr>
-            <w:tcW w:type="dxa" w:w="2041"/>
+            <w:tcW w:type="dxa" w:w="1485"/>
             <w:tcBorders>
               <w:top w:val="nil"/>
               <w:bottom w:val="nil"/>
@@ -1759,6 +1841,7 @@
           </w:tcPr>
           <w:p>
             <w:pPr>
+              <w:keepNext/>
               <w:spacing w:after="60" w:before="0"/>
               <w:jc w:val="center"/>
             </w:pPr>
@@ -1776,7 +1859,7 @@
         </w:tc>
         <w:tc>
           <w:tcPr>
-            <w:tcW w:type="dxa" w:w="2041"/>
+            <w:tcW w:type="dxa" w:w="1485"/>
             <w:tcBorders>
               <w:top w:val="nil"/>
               <w:bottom w:val="nil"/>
@@ -1789,6 +1872,7 @@
           </w:tcPr>
           <w:p>
             <w:pPr>
+              <w:keepNext/>
               <w:spacing w:after="60" w:before="0"/>
               <w:jc w:val="center"/>
             </w:pPr>
@@ -1806,7 +1890,7 @@
         </w:tc>
         <w:tc>
           <w:tcPr>
-            <w:tcW w:type="dxa" w:w="2041"/>
+            <w:tcW w:type="dxa" w:w="1485"/>
             <w:tcBorders>
               <w:top w:val="nil"/>
               <w:bottom w:val="nil"/>
@@ -1819,6 +1903,7 @@
           </w:tcPr>
           <w:p>
             <w:pPr>
+              <w:keepNext/>
               <w:spacing w:after="60" w:before="0"/>
               <w:jc w:val="center"/>
             </w:pPr>
@@ -1836,7 +1921,7 @@
         </w:tc>
         <w:tc>
           <w:tcPr>
-            <w:tcW w:type="dxa" w:w="2041"/>
+            <w:tcW w:type="dxa" w:w="1485"/>
             <w:tcBorders>
               <w:top w:val="nil"/>
               <w:bottom w:val="nil"/>
@@ -1849,6 +1934,7 @@
           </w:tcPr>
           <w:p>
             <w:pPr>
+              <w:keepNext/>
               <w:spacing w:after="60" w:before="0"/>
               <w:jc w:val="center"/>
             </w:pPr>
@@ -1866,9 +1952,12 @@
         </w:tc>
       </w:tr>
       <w:tr>
+        <w:trPr>
+          <w:cantSplit/>
+        </w:trPr>
         <w:tc>
           <w:tcPr>
-            <w:tcW w:type="dxa" w:w="2494"/>
+            <w:tcW w:type="dxa" w:w="2154"/>
             <w:tcBorders>
               <w:top w:val="nil"/>
               <w:bottom w:val="nil"/>
@@ -1881,6 +1970,7 @@
           </w:tcPr>
           <w:p>
             <w:pPr>
+              <w:keepNext/>
               <w:spacing w:after="60" w:before="0"/>
               <w:jc w:val="left"/>
             </w:pPr>
@@ -1898,7 +1988,7 @@
         </w:tc>
         <w:tc>
           <w:tcPr>
-            <w:tcW w:type="dxa" w:w="2041"/>
+            <w:tcW w:type="dxa" w:w="1485"/>
             <w:tcBorders>
               <w:top w:val="nil"/>
               <w:bottom w:val="nil"/>
@@ -1911,6 +2001,7 @@
           </w:tcPr>
           <w:p>
             <w:pPr>
+              <w:keepNext/>
               <w:spacing w:after="60" w:before="0"/>
               <w:jc w:val="center"/>
             </w:pPr>
@@ -1928,7 +2019,7 @@
         </w:tc>
         <w:tc>
           <w:tcPr>
-            <w:tcW w:type="dxa" w:w="2041"/>
+            <w:tcW w:type="dxa" w:w="1485"/>
             <w:tcBorders>
               <w:top w:val="nil"/>
               <w:bottom w:val="nil"/>
@@ -1941,6 +2032,7 @@
           </w:tcPr>
           <w:p>
             <w:pPr>
+              <w:keepNext/>
               <w:spacing w:after="60" w:before="0"/>
               <w:jc w:val="center"/>
             </w:pPr>
@@ -1958,7 +2050,7 @@
         </w:tc>
         <w:tc>
           <w:tcPr>
-            <w:tcW w:type="dxa" w:w="2041"/>
+            <w:tcW w:type="dxa" w:w="1485"/>
             <w:tcBorders>
               <w:top w:val="nil"/>
               <w:bottom w:val="nil"/>
@@ -1971,6 +2063,7 @@
           </w:tcPr>
           <w:p>
             <w:pPr>
+              <w:keepNext/>
               <w:spacing w:after="60" w:before="0"/>
               <w:jc w:val="center"/>
             </w:pPr>
@@ -1988,7 +2081,7 @@
         </w:tc>
         <w:tc>
           <w:tcPr>
-            <w:tcW w:type="dxa" w:w="2041"/>
+            <w:tcW w:type="dxa" w:w="1485"/>
             <w:tcBorders>
               <w:top w:val="nil"/>
               <w:bottom w:val="nil"/>
@@ -2001,6 +2094,7 @@
           </w:tcPr>
           <w:p>
             <w:pPr>
+              <w:keepNext/>
               <w:spacing w:after="60" w:before="0"/>
               <w:jc w:val="center"/>
             </w:pPr>
@@ -2018,7 +2112,7 @@
         </w:tc>
         <w:tc>
           <w:tcPr>
-            <w:tcW w:type="dxa" w:w="2041"/>
+            <w:tcW w:type="dxa" w:w="1485"/>
             <w:tcBorders>
               <w:top w:val="nil"/>
               <w:bottom w:val="nil"/>
@@ -2031,6 +2125,7 @@
           </w:tcPr>
           <w:p>
             <w:pPr>
+              <w:keepNext/>
               <w:spacing w:after="60" w:before="0"/>
               <w:jc w:val="center"/>
             </w:pPr>
@@ -2048,9 +2143,12 @@
         </w:tc>
       </w:tr>
       <w:tr>
+        <w:trPr>
+          <w:cantSplit/>
+        </w:trPr>
         <w:tc>
           <w:tcPr>
-            <w:tcW w:type="dxa" w:w="2494"/>
+            <w:tcW w:type="dxa" w:w="2154"/>
             <w:tcBorders>
               <w:top w:val="nil"/>
               <w:bottom w:val="nil"/>
@@ -2063,6 +2161,7 @@
           </w:tcPr>
           <w:p>
             <w:pPr>
+              <w:keepNext/>
               <w:spacing w:after="60" w:before="0"/>
               <w:jc w:val="left"/>
             </w:pPr>
@@ -2080,7 +2179,7 @@
         </w:tc>
         <w:tc>
           <w:tcPr>
-            <w:tcW w:type="dxa" w:w="2041"/>
+            <w:tcW w:type="dxa" w:w="1485"/>
             <w:tcBorders>
               <w:top w:val="nil"/>
               <w:bottom w:val="nil"/>
@@ -2093,6 +2192,7 @@
           </w:tcPr>
           <w:p>
             <w:pPr>
+              <w:keepNext/>
               <w:spacing w:after="60" w:before="0"/>
               <w:jc w:val="center"/>
             </w:pPr>
@@ -2110,7 +2210,7 @@
         </w:tc>
         <w:tc>
           <w:tcPr>
-            <w:tcW w:type="dxa" w:w="2041"/>
+            <w:tcW w:type="dxa" w:w="1485"/>
             <w:tcBorders>
               <w:top w:val="nil"/>
               <w:bottom w:val="nil"/>
@@ -2123,6 +2223,7 @@
           </w:tcPr>
           <w:p>
             <w:pPr>
+              <w:keepNext/>
               <w:spacing w:after="60" w:before="0"/>
               <w:jc w:val="center"/>
             </w:pPr>
@@ -2140,7 +2241,7 @@
         </w:tc>
         <w:tc>
           <w:tcPr>
-            <w:tcW w:type="dxa" w:w="2041"/>
+            <w:tcW w:type="dxa" w:w="1485"/>
             <w:tcBorders>
               <w:top w:val="nil"/>
               <w:bottom w:val="nil"/>
@@ -2153,6 +2254,7 @@
           </w:tcPr>
           <w:p>
             <w:pPr>
+              <w:keepNext/>
               <w:spacing w:after="60" w:before="0"/>
               <w:jc w:val="center"/>
             </w:pPr>
@@ -2170,7 +2272,7 @@
         </w:tc>
         <w:tc>
           <w:tcPr>
-            <w:tcW w:type="dxa" w:w="2041"/>
+            <w:tcW w:type="dxa" w:w="1485"/>
             <w:tcBorders>
               <w:top w:val="nil"/>
               <w:bottom w:val="nil"/>
@@ -2183,6 +2285,7 @@
           </w:tcPr>
           <w:p>
             <w:pPr>
+              <w:keepNext/>
               <w:spacing w:after="60" w:before="0"/>
               <w:jc w:val="center"/>
             </w:pPr>
@@ -2200,7 +2303,7 @@
         </w:tc>
         <w:tc>
           <w:tcPr>
-            <w:tcW w:type="dxa" w:w="2041"/>
+            <w:tcW w:type="dxa" w:w="1485"/>
             <w:tcBorders>
               <w:top w:val="nil"/>
               <w:bottom w:val="nil"/>
@@ -2213,6 +2316,7 @@
           </w:tcPr>
           <w:p>
             <w:pPr>
+              <w:keepNext/>
               <w:spacing w:after="60" w:before="0"/>
               <w:jc w:val="center"/>
             </w:pPr>
@@ -2230,9 +2334,12 @@
         </w:tc>
       </w:tr>
       <w:tr>
+        <w:trPr>
+          <w:cantSplit/>
+        </w:trPr>
         <w:tc>
           <w:tcPr>
-            <w:tcW w:type="dxa" w:w="2494"/>
+            <w:tcW w:type="dxa" w:w="2154"/>
             <w:tcBorders>
               <w:top w:val="nil"/>
               <w:bottom w:val="nil"/>
@@ -2245,6 +2352,7 @@
           </w:tcPr>
           <w:p>
             <w:pPr>
+              <w:keepNext/>
               <w:spacing w:after="60" w:before="0"/>
               <w:jc w:val="left"/>
             </w:pPr>
@@ -2256,13 +2364,13 @@
                 <w:i/>
                 <w:sz w:val="21"/>
               </w:rPr>
-              <w:t>TabPFN v3 (Prior Labs)</w:t>
+              <w:t>TabPFN v3</w:t>
             </w:r>
           </w:p>
         </w:tc>
         <w:tc>
           <w:tcPr>
-            <w:tcW w:type="dxa" w:w="2041"/>
+            <w:tcW w:type="dxa" w:w="1485"/>
             <w:tcBorders>
               <w:top w:val="nil"/>
               <w:bottom w:val="nil"/>
@@ -2275,6 +2383,7 @@
           </w:tcPr>
           <w:p>
             <w:pPr>
+              <w:keepNext/>
               <w:spacing w:after="60" w:before="0"/>
               <w:jc w:val="center"/>
             </w:pPr>
@@ -2292,7 +2401,7 @@
         </w:tc>
         <w:tc>
           <w:tcPr>
-            <w:tcW w:type="dxa" w:w="2041"/>
+            <w:tcW w:type="dxa" w:w="1485"/>
             <w:tcBorders>
               <w:top w:val="nil"/>
               <w:bottom w:val="nil"/>
@@ -2305,6 +2414,7 @@
           </w:tcPr>
           <w:p>
             <w:pPr>
+              <w:keepNext/>
               <w:spacing w:after="60" w:before="0"/>
               <w:jc w:val="center"/>
             </w:pPr>
@@ -2322,7 +2432,7 @@
         </w:tc>
         <w:tc>
           <w:tcPr>
-            <w:tcW w:type="dxa" w:w="2041"/>
+            <w:tcW w:type="dxa" w:w="1485"/>
             <w:tcBorders>
               <w:top w:val="nil"/>
               <w:bottom w:val="nil"/>
@@ -2335,6 +2445,7 @@
           </w:tcPr>
           <w:p>
             <w:pPr>
+              <w:keepNext/>
               <w:spacing w:after="60" w:before="0"/>
               <w:jc w:val="center"/>
             </w:pPr>
@@ -2352,7 +2463,7 @@
         </w:tc>
         <w:tc>
           <w:tcPr>
-            <w:tcW w:type="dxa" w:w="2041"/>
+            <w:tcW w:type="dxa" w:w="1485"/>
             <w:tcBorders>
               <w:top w:val="nil"/>
               <w:bottom w:val="nil"/>
@@ -2365,6 +2476,7 @@
           </w:tcPr>
           <w:p>
             <w:pPr>
+              <w:keepNext/>
               <w:spacing w:after="60" w:before="0"/>
               <w:jc w:val="center"/>
             </w:pPr>
@@ -2382,7 +2494,7 @@
         </w:tc>
         <w:tc>
           <w:tcPr>
-            <w:tcW w:type="dxa" w:w="2041"/>
+            <w:tcW w:type="dxa" w:w="1485"/>
             <w:tcBorders>
               <w:top w:val="nil"/>
               <w:bottom w:val="nil"/>
@@ -2395,6 +2507,7 @@
           </w:tcPr>
           <w:p>
             <w:pPr>
+              <w:keepNext/>
               <w:spacing w:after="60" w:before="0"/>
               <w:jc w:val="center"/>
             </w:pPr>
@@ -2412,9 +2525,12 @@
         </w:tc>
       </w:tr>
       <w:tr>
+        <w:trPr>
+          <w:cantSplit/>
+        </w:trPr>
         <w:tc>
           <w:tcPr>
-            <w:tcW w:type="dxa" w:w="12699"/>
+            <w:tcW w:type="dxa" w:w="9579"/>
             <w:gridSpan w:val="6"/>
             <w:tcBorders>
               <w:top w:val="nil"/>
@@ -2428,7 +2544,8 @@
           </w:tcPr>
           <w:p>
             <w:pPr>
-              <w:spacing w:after="60" w:before="120"/>
+              <w:keepNext/>
+              <w:spacing w:after="60" w:before="60"/>
               <w:jc w:val="left"/>
             </w:pPr>
             <w:r/>
@@ -2445,9 +2562,12 @@
         </w:tc>
       </w:tr>
       <w:tr>
+        <w:trPr>
+          <w:cantSplit/>
+        </w:trPr>
         <w:tc>
           <w:tcPr>
-            <w:tcW w:type="dxa" w:w="2494"/>
+            <w:tcW w:type="dxa" w:w="2154"/>
             <w:tcBorders>
               <w:top w:val="nil"/>
               <w:bottom w:val="nil"/>
@@ -2460,6 +2580,7 @@
           </w:tcPr>
           <w:p>
             <w:pPr>
+              <w:keepNext/>
               <w:spacing w:after="60" w:before="0"/>
               <w:jc w:val="left"/>
             </w:pPr>
@@ -2477,7 +2598,7 @@
         </w:tc>
         <w:tc>
           <w:tcPr>
-            <w:tcW w:type="dxa" w:w="2041"/>
+            <w:tcW w:type="dxa" w:w="1485"/>
             <w:tcBorders>
               <w:top w:val="nil"/>
               <w:bottom w:val="nil"/>
@@ -2490,6 +2611,7 @@
           </w:tcPr>
           <w:p>
             <w:pPr>
+              <w:keepNext/>
               <w:spacing w:after="60" w:before="0"/>
               <w:jc w:val="center"/>
             </w:pPr>
@@ -2507,7 +2629,7 @@
         </w:tc>
         <w:tc>
           <w:tcPr>
-            <w:tcW w:type="dxa" w:w="2041"/>
+            <w:tcW w:type="dxa" w:w="1485"/>
             <w:tcBorders>
               <w:top w:val="nil"/>
               <w:bottom w:val="nil"/>
@@ -2520,6 +2642,7 @@
           </w:tcPr>
           <w:p>
             <w:pPr>
+              <w:keepNext/>
               <w:spacing w:after="60" w:before="0"/>
               <w:jc w:val="center"/>
             </w:pPr>
@@ -2537,7 +2660,7 @@
         </w:tc>
         <w:tc>
           <w:tcPr>
-            <w:tcW w:type="dxa" w:w="2041"/>
+            <w:tcW w:type="dxa" w:w="1485"/>
             <w:tcBorders>
               <w:top w:val="nil"/>
               <w:bottom w:val="nil"/>
@@ -2550,6 +2673,7 @@
           </w:tcPr>
           <w:p>
             <w:pPr>
+              <w:keepNext/>
               <w:spacing w:after="60" w:before="0"/>
               <w:jc w:val="center"/>
             </w:pPr>
@@ -2567,7 +2691,7 @@
         </w:tc>
         <w:tc>
           <w:tcPr>
-            <w:tcW w:type="dxa" w:w="2041"/>
+            <w:tcW w:type="dxa" w:w="1485"/>
             <w:tcBorders>
               <w:top w:val="nil"/>
               <w:bottom w:val="nil"/>
@@ -2580,6 +2704,7 @@
           </w:tcPr>
           <w:p>
             <w:pPr>
+              <w:keepNext/>
               <w:spacing w:after="60" w:before="0"/>
               <w:jc w:val="center"/>
             </w:pPr>
@@ -2597,7 +2722,7 @@
         </w:tc>
         <w:tc>
           <w:tcPr>
-            <w:tcW w:type="dxa" w:w="2041"/>
+            <w:tcW w:type="dxa" w:w="1485"/>
             <w:tcBorders>
               <w:top w:val="nil"/>
               <w:bottom w:val="nil"/>
@@ -2610,6 +2735,7 @@
           </w:tcPr>
           <w:p>
             <w:pPr>
+              <w:keepNext/>
               <w:spacing w:after="60" w:before="0"/>
               <w:jc w:val="center"/>
             </w:pPr>
@@ -2627,9 +2753,12 @@
         </w:tc>
       </w:tr>
       <w:tr>
+        <w:trPr>
+          <w:cantSplit/>
+        </w:trPr>
         <w:tc>
           <w:tcPr>
-            <w:tcW w:type="dxa" w:w="2494"/>
+            <w:tcW w:type="dxa" w:w="2154"/>
             <w:tcBorders>
               <w:top w:val="nil"/>
               <w:bottom w:val="nil"/>
@@ -2642,6 +2771,7 @@
           </w:tcPr>
           <w:p>
             <w:pPr>
+              <w:keepNext/>
               <w:spacing w:after="60" w:before="0"/>
               <w:jc w:val="left"/>
             </w:pPr>
@@ -2659,7 +2789,7 @@
         </w:tc>
         <w:tc>
           <w:tcPr>
-            <w:tcW w:type="dxa" w:w="2041"/>
+            <w:tcW w:type="dxa" w:w="1485"/>
             <w:tcBorders>
               <w:top w:val="nil"/>
               <w:bottom w:val="nil"/>
@@ -2672,6 +2802,7 @@
           </w:tcPr>
           <w:p>
             <w:pPr>
+              <w:keepNext/>
               <w:spacing w:after="60" w:before="0"/>
               <w:jc w:val="center"/>
             </w:pPr>
@@ -2689,7 +2820,7 @@
         </w:tc>
         <w:tc>
           <w:tcPr>
-            <w:tcW w:type="dxa" w:w="2041"/>
+            <w:tcW w:type="dxa" w:w="1485"/>
             <w:tcBorders>
               <w:top w:val="nil"/>
               <w:bottom w:val="nil"/>
@@ -2702,6 +2833,7 @@
           </w:tcPr>
           <w:p>
             <w:pPr>
+              <w:keepNext/>
               <w:spacing w:after="60" w:before="0"/>
               <w:jc w:val="center"/>
             </w:pPr>
@@ -2719,7 +2851,7 @@
         </w:tc>
         <w:tc>
           <w:tcPr>
-            <w:tcW w:type="dxa" w:w="2041"/>
+            <w:tcW w:type="dxa" w:w="1485"/>
             <w:tcBorders>
               <w:top w:val="nil"/>
               <w:bottom w:val="nil"/>
@@ -2732,6 +2864,7 @@
           </w:tcPr>
           <w:p>
             <w:pPr>
+              <w:keepNext/>
               <w:spacing w:after="60" w:before="0"/>
               <w:jc w:val="center"/>
             </w:pPr>
@@ -2749,7 +2882,7 @@
         </w:tc>
         <w:tc>
           <w:tcPr>
-            <w:tcW w:type="dxa" w:w="2041"/>
+            <w:tcW w:type="dxa" w:w="1485"/>
             <w:tcBorders>
               <w:top w:val="nil"/>
               <w:bottom w:val="nil"/>
@@ -2762,6 +2895,7 @@
           </w:tcPr>
           <w:p>
             <w:pPr>
+              <w:keepNext/>
               <w:spacing w:after="60" w:before="0"/>
               <w:jc w:val="center"/>
             </w:pPr>
@@ -2779,7 +2913,7 @@
         </w:tc>
         <w:tc>
           <w:tcPr>
-            <w:tcW w:type="dxa" w:w="2041"/>
+            <w:tcW w:type="dxa" w:w="1485"/>
             <w:tcBorders>
               <w:top w:val="nil"/>
               <w:bottom w:val="nil"/>
@@ -2792,6 +2926,7 @@
           </w:tcPr>
           <w:p>
             <w:pPr>
+              <w:keepNext/>
               <w:spacing w:after="60" w:before="0"/>
               <w:jc w:val="center"/>
             </w:pPr>
@@ -2809,9 +2944,12 @@
         </w:tc>
       </w:tr>
       <w:tr>
+        <w:trPr>
+          <w:cantSplit/>
+        </w:trPr>
         <w:tc>
           <w:tcPr>
-            <w:tcW w:type="dxa" w:w="2494"/>
+            <w:tcW w:type="dxa" w:w="2154"/>
             <w:tcBorders>
               <w:top w:val="nil"/>
               <w:bottom w:val="nil"/>
@@ -2824,6 +2962,7 @@
           </w:tcPr>
           <w:p>
             <w:pPr>
+              <w:keepNext/>
               <w:spacing w:after="60" w:before="0"/>
               <w:jc w:val="left"/>
             </w:pPr>
@@ -2841,7 +2980,7 @@
         </w:tc>
         <w:tc>
           <w:tcPr>
-            <w:tcW w:type="dxa" w:w="2041"/>
+            <w:tcW w:type="dxa" w:w="1485"/>
             <w:tcBorders>
               <w:top w:val="nil"/>
               <w:bottom w:val="nil"/>
@@ -2854,6 +2993,7 @@
           </w:tcPr>
           <w:p>
             <w:pPr>
+              <w:keepNext/>
               <w:spacing w:after="60" w:before="0"/>
               <w:jc w:val="center"/>
             </w:pPr>
@@ -2871,7 +3011,7 @@
         </w:tc>
         <w:tc>
           <w:tcPr>
-            <w:tcW w:type="dxa" w:w="2041"/>
+            <w:tcW w:type="dxa" w:w="1485"/>
             <w:tcBorders>
               <w:top w:val="nil"/>
               <w:bottom w:val="nil"/>
@@ -2884,6 +3024,7 @@
           </w:tcPr>
           <w:p>
             <w:pPr>
+              <w:keepNext/>
               <w:spacing w:after="60" w:before="0"/>
               <w:jc w:val="center"/>
             </w:pPr>
@@ -2901,7 +3042,7 @@
         </w:tc>
         <w:tc>
           <w:tcPr>
-            <w:tcW w:type="dxa" w:w="2041"/>
+            <w:tcW w:type="dxa" w:w="1485"/>
             <w:tcBorders>
               <w:top w:val="nil"/>
               <w:bottom w:val="nil"/>
@@ -2914,6 +3055,7 @@
           </w:tcPr>
           <w:p>
             <w:pPr>
+              <w:keepNext/>
               <w:spacing w:after="60" w:before="0"/>
               <w:jc w:val="center"/>
             </w:pPr>
@@ -2931,7 +3073,7 @@
         </w:tc>
         <w:tc>
           <w:tcPr>
-            <w:tcW w:type="dxa" w:w="2041"/>
+            <w:tcW w:type="dxa" w:w="1485"/>
             <w:tcBorders>
               <w:top w:val="nil"/>
               <w:bottom w:val="nil"/>
@@ -2944,6 +3086,7 @@
           </w:tcPr>
           <w:p>
             <w:pPr>
+              <w:keepNext/>
               <w:spacing w:after="60" w:before="0"/>
               <w:jc w:val="center"/>
             </w:pPr>
@@ -2961,7 +3104,7 @@
         </w:tc>
         <w:tc>
           <w:tcPr>
-            <w:tcW w:type="dxa" w:w="2041"/>
+            <w:tcW w:type="dxa" w:w="1485"/>
             <w:tcBorders>
               <w:top w:val="nil"/>
               <w:bottom w:val="nil"/>
@@ -2974,6 +3117,7 @@
           </w:tcPr>
           <w:p>
             <w:pPr>
+              <w:keepNext/>
               <w:spacing w:after="60" w:before="0"/>
               <w:jc w:val="center"/>
             </w:pPr>
@@ -2991,9 +3135,12 @@
         </w:tc>
       </w:tr>
       <w:tr>
+        <w:trPr>
+          <w:cantSplit/>
+        </w:trPr>
         <w:tc>
           <w:tcPr>
-            <w:tcW w:type="dxa" w:w="2494"/>
+            <w:tcW w:type="dxa" w:w="2154"/>
             <w:tcBorders>
               <w:top w:val="nil"/>
               <w:bottom w:val="nil"/>
@@ -3006,6 +3153,7 @@
           </w:tcPr>
           <w:p>
             <w:pPr>
+              <w:keepNext/>
               <w:spacing w:after="60" w:before="0"/>
               <w:jc w:val="left"/>
             </w:pPr>
@@ -3023,7 +3171,7 @@
         </w:tc>
         <w:tc>
           <w:tcPr>
-            <w:tcW w:type="dxa" w:w="2041"/>
+            <w:tcW w:type="dxa" w:w="1485"/>
             <w:tcBorders>
               <w:top w:val="nil"/>
               <w:bottom w:val="nil"/>
@@ -3036,6 +3184,7 @@
           </w:tcPr>
           <w:p>
             <w:pPr>
+              <w:keepNext/>
               <w:spacing w:after="60" w:before="0"/>
               <w:jc w:val="center"/>
             </w:pPr>
@@ -3053,7 +3202,7 @@
         </w:tc>
         <w:tc>
           <w:tcPr>
-            <w:tcW w:type="dxa" w:w="2041"/>
+            <w:tcW w:type="dxa" w:w="1485"/>
             <w:tcBorders>
               <w:top w:val="nil"/>
               <w:bottom w:val="nil"/>
@@ -3066,6 +3215,7 @@
           </w:tcPr>
           <w:p>
             <w:pPr>
+              <w:keepNext/>
               <w:spacing w:after="60" w:before="0"/>
               <w:jc w:val="center"/>
             </w:pPr>
@@ -3083,7 +3233,7 @@
         </w:tc>
         <w:tc>
           <w:tcPr>
-            <w:tcW w:type="dxa" w:w="2041"/>
+            <w:tcW w:type="dxa" w:w="1485"/>
             <w:tcBorders>
               <w:top w:val="nil"/>
               <w:bottom w:val="nil"/>
@@ -3096,6 +3246,7 @@
           </w:tcPr>
           <w:p>
             <w:pPr>
+              <w:keepNext/>
               <w:spacing w:after="60" w:before="0"/>
               <w:jc w:val="center"/>
             </w:pPr>
@@ -3113,7 +3264,7 @@
         </w:tc>
         <w:tc>
           <w:tcPr>
-            <w:tcW w:type="dxa" w:w="2041"/>
+            <w:tcW w:type="dxa" w:w="1485"/>
             <w:tcBorders>
               <w:top w:val="nil"/>
               <w:bottom w:val="nil"/>
@@ -3126,6 +3277,7 @@
           </w:tcPr>
           <w:p>
             <w:pPr>
+              <w:keepNext/>
               <w:spacing w:after="60" w:before="0"/>
               <w:jc w:val="center"/>
             </w:pPr>
@@ -3143,7 +3295,7 @@
         </w:tc>
         <w:tc>
           <w:tcPr>
-            <w:tcW w:type="dxa" w:w="2041"/>
+            <w:tcW w:type="dxa" w:w="1485"/>
             <w:tcBorders>
               <w:top w:val="nil"/>
               <w:bottom w:val="nil"/>
@@ -3156,6 +3308,7 @@
           </w:tcPr>
           <w:p>
             <w:pPr>
+              <w:keepNext/>
               <w:spacing w:after="60" w:before="0"/>
               <w:jc w:val="center"/>
             </w:pPr>
@@ -3173,9 +3326,12 @@
         </w:tc>
       </w:tr>
       <w:tr>
+        <w:trPr>
+          <w:cantSplit/>
+        </w:trPr>
         <w:tc>
           <w:tcPr>
-            <w:tcW w:type="dxa" w:w="2494"/>
+            <w:tcW w:type="dxa" w:w="2154"/>
             <w:tcBorders>
               <w:top w:val="nil"/>
               <w:bottom w:val="single" w:sz="18" w:color="000000" w:space="0"/>
@@ -3199,13 +3355,13 @@
                 <w:i/>
                 <w:sz w:val="21"/>
               </w:rPr>
-              <w:t>TabPFN v3 (Prior Labs)</w:t>
+              <w:t>TabPFN v3</w:t>
             </w:r>
           </w:p>
         </w:tc>
         <w:tc>
           <w:tcPr>
-            <w:tcW w:type="dxa" w:w="2041"/>
+            <w:tcW w:type="dxa" w:w="1485"/>
             <w:tcBorders>
               <w:top w:val="nil"/>
               <w:bottom w:val="single" w:sz="18" w:color="000000" w:space="0"/>
@@ -3235,7 +3391,7 @@
         </w:tc>
         <w:tc>
           <w:tcPr>
-            <w:tcW w:type="dxa" w:w="2041"/>
+            <w:tcW w:type="dxa" w:w="1485"/>
             <w:tcBorders>
               <w:top w:val="nil"/>
               <w:bottom w:val="single" w:sz="18" w:color="000000" w:space="0"/>
@@ -3265,7 +3421,7 @@
         </w:tc>
         <w:tc>
           <w:tcPr>
-            <w:tcW w:type="dxa" w:w="2041"/>
+            <w:tcW w:type="dxa" w:w="1485"/>
             <w:tcBorders>
               <w:top w:val="nil"/>
               <w:bottom w:val="single" w:sz="18" w:color="000000" w:space="0"/>
@@ -3295,7 +3451,7 @@
         </w:tc>
         <w:tc>
           <w:tcPr>
-            <w:tcW w:type="dxa" w:w="2041"/>
+            <w:tcW w:type="dxa" w:w="1485"/>
             <w:tcBorders>
               <w:top w:val="nil"/>
               <w:bottom w:val="single" w:sz="18" w:color="000000" w:space="0"/>
@@ -3325,7 +3481,7 @@
         </w:tc>
         <w:tc>
           <w:tcPr>
-            <w:tcW w:type="dxa" w:w="2041"/>
+            <w:tcW w:type="dxa" w:w="1485"/>
             <w:tcBorders>
               <w:top w:val="nil"/>
               <w:bottom w:val="single" w:sz="18" w:color="000000" w:space="0"/>

</xml_diff>